<commit_message>
docs(sprint-3): CLAUDE.md actualizado + manuales v1.1 + acta cierre fase 4
- CLAUDE.md: tabla sub-fases con 4J/4K/4L/4M, RBAC matrix completa,
  auth stage 1 (mustChangePassword + reset email), seccion ops VPS
  (deploy/backup/restore)
- tools/build-manuals.js: script versionado para regenerar .docx
- docs/manuals/*.docx v1.1: novedades RBAC, cambio password, reset email,
  modo claro mapa, PDF dossier con cabecera AESA
- docs/ACTA-CIERRE-FASE-4.md: alcance entregado, metricas, diferidos,
  handover operativo, credenciales prod

Sprint 3.2 + 3.4 + 3.5 done. Pendiente 3.1 tests fix y 3.3 Notion (manual).

Co-Authored-By: Claude Sonnet 4.6 <noreply@anthropic.com>
</commit_message>
<xml_diff>
--- a/docs/manuals/manual-piloto.docx
+++ b/docs/manuals/manual-piloto.docx
@@ -97,7 +97,7 @@
           <w:sz w:val="22"/>
           <w:szCs w:val="22"/>
         </w:rPr>
-        <w:t xml:space="preserve">Versión: 1.0 — 2026-04-30</w:t>
+        <w:t xml:space="preserve">Versión: 1.1 — 2026-05-02</w:t>
       </w:r>
     </w:p>
     <w:p>
@@ -137,6 +137,176 @@
           <w:sz w:val="32"/>
           <w:szCs w:val="32"/>
         </w:rPr>
+        <w:t xml:space="preserve">Novedades en v1.1</w:t>
+      </w:r>
+    </w:p>
+    <w:p>
+      <w:pPr>
+        <w:pStyle w:val="ListParagraph"/>
+        <w:numPr>
+          <w:ilvl w:val="0"/>
+          <w:numId w:val="2"/>
+        </w:numPr>
+        <w:spacing w:after="80"/>
+      </w:pPr>
+      <w:r>
+        <w:rPr>
+          <w:rFonts w:ascii="Arial" w:cs="Arial" w:eastAsia="Arial" w:hAnsi="Arial"/>
+          <w:b/>
+          <w:bCs/>
+          <w:color w:val="1A2433"/>
+          <w:sz w:val="22"/>
+          <w:szCs w:val="22"/>
+        </w:rPr>
+        <w:t xml:space="preserve">Modo claro/oscuro: </w:t>
+      </w:r>
+      <w:r>
+        <w:rPr>
+          <w:rFonts w:ascii="Arial" w:cs="Arial" w:eastAsia="Arial" w:hAnsi="Arial"/>
+          <w:color w:val="1A2433"/>
+          <w:sz w:val="22"/>
+          <w:szCs w:val="22"/>
+        </w:rPr>
+        <w:t xml:space="preserve">el toggle en la esquina inferior izquierda del sidebar cambia ahora también el mapa (claro de día, oscuro de noche)</w:t>
+      </w:r>
+    </w:p>
+    <w:p>
+      <w:pPr>
+        <w:pStyle w:val="ListParagraph"/>
+        <w:numPr>
+          <w:ilvl w:val="0"/>
+          <w:numId w:val="2"/>
+        </w:numPr>
+        <w:spacing w:after="80"/>
+      </w:pPr>
+      <w:r>
+        <w:rPr>
+          <w:rFonts w:ascii="Arial" w:cs="Arial" w:eastAsia="Arial" w:hAnsi="Arial"/>
+          <w:b/>
+          <w:bCs/>
+          <w:color w:val="1A2433"/>
+          <w:sz w:val="22"/>
+          <w:szCs w:val="22"/>
+        </w:rPr>
+        <w:t xml:space="preserve">Cambio de contraseña obligatorio: </w:t>
+      </w:r>
+      <w:r>
+        <w:rPr>
+          <w:rFonts w:ascii="Arial" w:cs="Arial" w:eastAsia="Arial" w:hAnsi="Arial"/>
+          <w:color w:val="1A2433"/>
+          <w:sz w:val="22"/>
+          <w:szCs w:val="22"/>
+        </w:rPr>
+        <w:t xml:space="preserve">en tu primer login el sistema te llevará automáticamente a una pantalla para cambiar la contraseña inicial</w:t>
+      </w:r>
+    </w:p>
+    <w:p>
+      <w:pPr>
+        <w:pStyle w:val="ListParagraph"/>
+        <w:numPr>
+          <w:ilvl w:val="0"/>
+          <w:numId w:val="2"/>
+        </w:numPr>
+        <w:spacing w:after="80"/>
+      </w:pPr>
+      <w:r>
+        <w:rPr>
+          <w:rFonts w:ascii="Arial" w:cs="Arial" w:eastAsia="Arial" w:hAnsi="Arial"/>
+          <w:b/>
+          <w:bCs/>
+          <w:color w:val="1A2433"/>
+          <w:sz w:val="22"/>
+          <w:szCs w:val="22"/>
+        </w:rPr>
+        <w:t xml:space="preserve">¿Olvidaste la contraseña?: </w:t>
+      </w:r>
+      <w:r>
+        <w:rPr>
+          <w:rFonts w:ascii="Arial" w:cs="Arial" w:eastAsia="Arial" w:hAnsi="Arial"/>
+          <w:color w:val="1A2433"/>
+          <w:sz w:val="22"/>
+          <w:szCs w:val="22"/>
+        </w:rPr>
+        <w:t xml:space="preserve">ahora hay un enlace en el login. Te llega un email con un enlace temporal (válido 1 hora) para crear una nueva contraseña</w:t>
+      </w:r>
+    </w:p>
+    <w:p>
+      <w:pPr>
+        <w:pStyle w:val="ListParagraph"/>
+        <w:numPr>
+          <w:ilvl w:val="0"/>
+          <w:numId w:val="2"/>
+        </w:numPr>
+        <w:spacing w:after="80"/>
+      </w:pPr>
+      <w:r>
+        <w:rPr>
+          <w:rFonts w:ascii="Arial" w:cs="Arial" w:eastAsia="Arial" w:hAnsi="Arial"/>
+          <w:b/>
+          <w:bCs/>
+          <w:color w:val="1A2433"/>
+          <w:sz w:val="22"/>
+          <w:szCs w:val="22"/>
+        </w:rPr>
+        <w:t xml:space="preserve">Vista por rol: </w:t>
+      </w:r>
+      <w:r>
+        <w:rPr>
+          <w:rFonts w:ascii="Arial" w:cs="Arial" w:eastAsia="Arial" w:hAnsi="Arial"/>
+          <w:color w:val="1A2433"/>
+          <w:sz w:val="22"/>
+          <w:szCs w:val="22"/>
+        </w:rPr>
+        <w:t xml:space="preserve">como piloto solo verás las misiones que te han asignado. El resto del operador queda fuera</w:t>
+      </w:r>
+    </w:p>
+    <w:p>
+      <w:pPr>
+        <w:pStyle w:val="ListParagraph"/>
+        <w:numPr>
+          <w:ilvl w:val="0"/>
+          <w:numId w:val="2"/>
+        </w:numPr>
+        <w:spacing w:after="80"/>
+      </w:pPr>
+      <w:r>
+        <w:rPr>
+          <w:rFonts w:ascii="Arial" w:cs="Arial" w:eastAsia="Arial" w:hAnsi="Arial"/>
+          <w:b/>
+          <w:bCs/>
+          <w:color w:val="1A2433"/>
+          <w:sz w:val="22"/>
+          <w:szCs w:val="22"/>
+        </w:rPr>
+        <w:t xml:space="preserve">PDF dossier mejorado: </w:t>
+      </w:r>
+      <w:r>
+        <w:rPr>
+          <w:rFonts w:ascii="Arial" w:cs="Arial" w:eastAsia="Arial" w:hAnsi="Arial"/>
+          <w:color w:val="1A2433"/>
+          <w:sz w:val="22"/>
+          <w:szCs w:val="22"/>
+        </w:rPr>
+        <w:t xml:space="preserve">los PDFs de compliance ahora llevan cabecera completa del operador (NIF, registro AESA, CSV)</w:t>
+      </w:r>
+    </w:p>
+    <w:p>
+      <w:pPr>
+        <w:pStyle w:val="Heading1"/>
+        <w:pBdr>
+          <w:bottom w:val="single" w:color="0C9FD8" w:sz="12" w:space="4"/>
+        </w:pBdr>
+        <w:spacing w:after="200" w:before="360"/>
+      </w:pPr>
+      <w:r>
+        <w:rPr>
+          <w:rFonts w:ascii="Arial" w:cs="Arial" w:eastAsia="Arial" w:hAnsi="Arial"/>
+          <w:b/>
+          <w:bCs/>
+          <w:color w:val="0D1520"/>
+          <w:sz w:val="32"/>
+          <w:szCs w:val="32"/>
+        </w:rPr>
         <w:t xml:space="preserve">1. Tu primer login</w:t>
       </w:r>
     </w:p>
@@ -145,7 +315,7 @@
         <w:pStyle w:val="ListParagraph"/>
         <w:numPr>
           <w:ilvl w:val="0"/>
-          <w:numId w:val="2"/>
+          <w:numId w:val="3"/>
         </w:numPr>
         <w:spacing w:after="80"/>
       </w:pPr>
@@ -164,37 +334,75 @@
         <w:pStyle w:val="ListParagraph"/>
         <w:numPr>
           <w:ilvl w:val="0"/>
-          <w:numId w:val="2"/>
-        </w:numPr>
-        <w:spacing w:after="80"/>
-      </w:pPr>
-      <w:r>
-        <w:rPr>
-          <w:rFonts w:ascii="Arial" w:cs="Arial" w:eastAsia="Arial" w:hAnsi="Arial"/>
-          <w:color w:val="1A2433"/>
-          <w:sz w:val="22"/>
-          <w:szCs w:val="22"/>
-        </w:rPr>
-        <w:t xml:space="preserve">Email: el que te dio JuanCho</w:t>
-      </w:r>
-    </w:p>
-    <w:p>
-      <w:pPr>
-        <w:pStyle w:val="ListParagraph"/>
-        <w:numPr>
-          <w:ilvl w:val="0"/>
-          <w:numId w:val="2"/>
-        </w:numPr>
-        <w:spacing w:after="80"/>
-      </w:pPr>
-      <w:r>
-        <w:rPr>
-          <w:rFonts w:ascii="Arial" w:cs="Arial" w:eastAsia="Arial" w:hAnsi="Arial"/>
-          <w:color w:val="1A2433"/>
-          <w:sz w:val="22"/>
-          <w:szCs w:val="22"/>
-        </w:rPr>
-        <w:t xml:space="preserve">Contraseña: la inicial — cámbiala en cuanto entres</w:t>
+          <w:numId w:val="3"/>
+        </w:numPr>
+        <w:spacing w:after="80"/>
+      </w:pPr>
+      <w:r>
+        <w:rPr>
+          <w:rFonts w:ascii="Arial" w:cs="Arial" w:eastAsia="Arial" w:hAnsi="Arial"/>
+          <w:color w:val="1A2433"/>
+          <w:sz w:val="22"/>
+          <w:szCs w:val="22"/>
+        </w:rPr>
+        <w:t xml:space="preserve">Email: el que te dio Luis o JuanCho</w:t>
+      </w:r>
+    </w:p>
+    <w:p>
+      <w:pPr>
+        <w:pStyle w:val="ListParagraph"/>
+        <w:numPr>
+          <w:ilvl w:val="0"/>
+          <w:numId w:val="3"/>
+        </w:numPr>
+        <w:spacing w:after="80"/>
+      </w:pPr>
+      <w:r>
+        <w:rPr>
+          <w:rFonts w:ascii="Arial" w:cs="Arial" w:eastAsia="Arial" w:hAnsi="Arial"/>
+          <w:color w:val="1A2433"/>
+          <w:sz w:val="22"/>
+          <w:szCs w:val="22"/>
+        </w:rPr>
+        <w:t xml:space="preserve">Contraseña: la inicial que te entregaron</w:t>
+      </w:r>
+    </w:p>
+    <w:p>
+      <w:pPr>
+        <w:pStyle w:val="ListParagraph"/>
+        <w:numPr>
+          <w:ilvl w:val="0"/>
+          <w:numId w:val="3"/>
+        </w:numPr>
+        <w:spacing w:after="80"/>
+      </w:pPr>
+      <w:r>
+        <w:rPr>
+          <w:rFonts w:ascii="Arial" w:cs="Arial" w:eastAsia="Arial" w:hAnsi="Arial"/>
+          <w:color w:val="1A2433"/>
+          <w:sz w:val="22"/>
+          <w:szCs w:val="22"/>
+        </w:rPr>
+        <w:t xml:space="preserve">El sistema te lleva automáticamente a /change-password — debes crear una nueva (mín. 10 caracteres, 1 mayúscula, 1 minúscula, 1 número)</w:t>
+      </w:r>
+    </w:p>
+    <w:p>
+      <w:pPr>
+        <w:pStyle w:val="ListParagraph"/>
+        <w:numPr>
+          <w:ilvl w:val="0"/>
+          <w:numId w:val="3"/>
+        </w:numPr>
+        <w:spacing w:after="80"/>
+      </w:pPr>
+      <w:r>
+        <w:rPr>
+          <w:rFonts w:ascii="Arial" w:cs="Arial" w:eastAsia="Arial" w:hAnsi="Arial"/>
+          <w:color w:val="1A2433"/>
+          <w:sz w:val="22"/>
+          <w:szCs w:val="22"/>
+        </w:rPr>
+        <w:t xml:space="preserve">Después entras al cockpit con tu sesión normal</w:t>
       </w:r>
     </w:p>
     <w:p>
@@ -208,7 +416,27 @@
           <w:sz w:val="22"/>
           <w:szCs w:val="22"/>
         </w:rPr>
-        <w:t xml:space="preserve">Toda la app es dark cockpit por defecto. Si prefieres claro: esquina inferior izquierda del sidebar, icono sol/luna. Tu preferencia se recuerda en el navegador.</w:t>
+        <w:t xml:space="preserve">Toda la app es dark cockpit por defecto. Si prefieres claro: esquina inferior izquierda del sidebar, icono sol/luna.</w:t>
+      </w:r>
+    </w:p>
+    <w:p>
+      <w:pPr>
+        <w:pBdr>
+          <w:left w:val="single" w:color="F04E1C" w:sz="18" w:space="12"/>
+        </w:pBdr>
+        <w:spacing w:after="120" w:before="120"/>
+        <w:ind w:left="360"/>
+      </w:pPr>
+      <w:r>
+        <w:rPr>
+          <w:rFonts w:ascii="Arial" w:cs="Arial" w:eastAsia="Arial" w:hAnsi="Arial"/>
+          <w:i/>
+          <w:iCs/>
+          <w:color w:val="5A7A9A"/>
+          <w:sz w:val="22"/>
+          <w:szCs w:val="22"/>
+        </w:rPr>
+        <w:t xml:space="preserve">Si en algún momento olvidas la contraseña, en el login hay un enlace «¿Olvidaste tu contraseña?». Te llega un email con un enlace para crear una nueva (caduca en 1 hora).</w:t>
       </w:r>
     </w:p>
     <w:p>
@@ -495,7 +723,7 @@
                 <w:sz w:val="20"/>
                 <w:szCs w:val="20"/>
               </w:rPr>
-              <w:t xml:space="preserve">Lista o mapa de todas las misiones — crear, editar, cambiar estado</w:t>
+              <w:t xml:space="preserve">Lista o mapa de tus misiones — el sistema solo te muestra las tuyas</w:t>
             </w:r>
           </w:p>
         </w:tc>
@@ -557,7 +785,7 @@
                 <w:sz w:val="20"/>
                 <w:szCs w:val="20"/>
               </w:rPr>
-              <w:t xml:space="preserve">Drones y pilotos del operador con sus certificaciones</w:t>
+              <w:t xml:space="preserve">Drones y pilotos del operador con sus certificaciones (solo lectura)</w:t>
             </w:r>
           </w:p>
         </w:tc>
@@ -681,7 +909,7 @@
                 <w:sz w:val="20"/>
                 <w:szCs w:val="20"/>
               </w:rPr>
-              <w:t xml:space="preserve">Métricas de operación — horas vuelo, misiones por estado</w:t>
+              <w:t xml:space="preserve">No visible para tu rol (solo admin/coordinador)</w:t>
             </w:r>
           </w:p>
         </w:tc>
@@ -743,7 +971,7 @@
         <w:pStyle w:val="ListParagraph"/>
         <w:numPr>
           <w:ilvl w:val="0"/>
-          <w:numId w:val="3"/>
+          <w:numId w:val="2"/>
         </w:numPr>
         <w:spacing w:after="80"/>
       </w:pPr>
@@ -773,7 +1001,7 @@
         <w:pStyle w:val="ListParagraph"/>
         <w:numPr>
           <w:ilvl w:val="0"/>
-          <w:numId w:val="3"/>
+          <w:numId w:val="2"/>
         </w:numPr>
         <w:spacing w:after="80"/>
       </w:pPr>
@@ -803,7 +1031,7 @@
         <w:pStyle w:val="ListParagraph"/>
         <w:numPr>
           <w:ilvl w:val="0"/>
-          <w:numId w:val="3"/>
+          <w:numId w:val="2"/>
         </w:numPr>
         <w:spacing w:after="80"/>
       </w:pPr>
@@ -833,7 +1061,7 @@
         <w:pStyle w:val="ListParagraph"/>
         <w:numPr>
           <w:ilvl w:val="0"/>
-          <w:numId w:val="3"/>
+          <w:numId w:val="2"/>
         </w:numPr>
         <w:spacing w:after="80"/>
       </w:pPr>
@@ -852,7 +1080,7 @@
         <w:pStyle w:val="ListParagraph"/>
         <w:numPr>
           <w:ilvl w:val="0"/>
-          <w:numId w:val="3"/>
+          <w:numId w:val="2"/>
         </w:numPr>
         <w:spacing w:after="80"/>
       </w:pPr>
@@ -871,7 +1099,7 @@
         <w:pStyle w:val="ListParagraph"/>
         <w:numPr>
           <w:ilvl w:val="0"/>
-          <w:numId w:val="3"/>
+          <w:numId w:val="2"/>
         </w:numPr>
         <w:spacing w:after="80"/>
       </w:pPr>
@@ -921,7 +1149,7 @@
         <w:pStyle w:val="ListParagraph"/>
         <w:numPr>
           <w:ilvl w:val="0"/>
-          <w:numId w:val="2"/>
+          <w:numId w:val="3"/>
         </w:numPr>
         <w:spacing w:after="80"/>
       </w:pPr>
@@ -940,7 +1168,7 @@
         <w:pStyle w:val="ListParagraph"/>
         <w:numPr>
           <w:ilvl w:val="0"/>
-          <w:numId w:val="2"/>
+          <w:numId w:val="3"/>
         </w:numPr>
         <w:spacing w:after="80"/>
       </w:pPr>
@@ -959,7 +1187,7 @@
         <w:pStyle w:val="ListParagraph"/>
         <w:numPr>
           <w:ilvl w:val="0"/>
-          <w:numId w:val="2"/>
+          <w:numId w:val="3"/>
         </w:numPr>
         <w:spacing w:after="80"/>
       </w:pPr>
@@ -978,26 +1206,26 @@
         <w:pStyle w:val="ListParagraph"/>
         <w:numPr>
           <w:ilvl w:val="0"/>
-          <w:numId w:val="2"/>
-        </w:numPr>
-        <w:spacing w:after="80"/>
-      </w:pPr>
-      <w:r>
-        <w:rPr>
-          <w:rFonts w:ascii="Arial" w:cs="Arial" w:eastAsia="Arial" w:hAnsi="Arial"/>
-          <w:color w:val="1A2433"/>
-          <w:sz w:val="22"/>
-          <w:szCs w:val="22"/>
-        </w:rPr>
-        <w:t xml:space="preserve">Click en una zona NOTAM → popup con: ID, altitud (suelo → techo), descripción de la restricción, período activo</w:t>
-      </w:r>
-    </w:p>
-    <w:p>
-      <w:pPr>
-        <w:pStyle w:val="ListParagraph"/>
-        <w:numPr>
-          <w:ilvl w:val="0"/>
-          <w:numId w:val="2"/>
+          <w:numId w:val="3"/>
+        </w:numPr>
+        <w:spacing w:after="80"/>
+      </w:pPr>
+      <w:r>
+        <w:rPr>
+          <w:rFonts w:ascii="Arial" w:cs="Arial" w:eastAsia="Arial" w:hAnsi="Arial"/>
+          <w:color w:val="1A2433"/>
+          <w:sz w:val="22"/>
+          <w:szCs w:val="22"/>
+        </w:rPr>
+        <w:t xml:space="preserve">Click en una zona NOTAM → popup con: ID, altitud (suelo → techo), descripción de la restricción</w:t>
+      </w:r>
+    </w:p>
+    <w:p>
+      <w:pPr>
+        <w:pStyle w:val="ListParagraph"/>
+        <w:numPr>
+          <w:ilvl w:val="0"/>
+          <w:numId w:val="3"/>
         </w:numPr>
         <w:spacing w:after="80"/>
       </w:pPr>
@@ -1050,24 +1278,10 @@
     </w:p>
     <w:p>
       <w:pPr>
-        <w:spacing w:after="120" w:line="300"/>
-      </w:pPr>
-      <w:r>
-        <w:rPr>
-          <w:rFonts w:ascii="Arial" w:cs="Arial" w:eastAsia="Arial" w:hAnsi="Arial"/>
-          <w:color w:val="1A2433"/>
-          <w:sz w:val="22"/>
-          <w:szCs w:val="22"/>
-        </w:rPr>
-        <w:t xml:space="preserve">Vuelve al Cockpit o al panel derecho del Espacio OPS cuando hayas seleccionado tu misión:</w:t>
-      </w:r>
-    </w:p>
-    <w:p>
-      <w:pPr>
-        <w:pStyle w:val="ListParagraph"/>
-        <w:numPr>
-          <w:ilvl w:val="0"/>
-          <w:numId w:val="3"/>
+        <w:pStyle w:val="ListParagraph"/>
+        <w:numPr>
+          <w:ilvl w:val="0"/>
+          <w:numId w:val="2"/>
         </w:numPr>
         <w:spacing w:after="80"/>
       </w:pPr>
@@ -1086,7 +1300,7 @@
         <w:pStyle w:val="ListParagraph"/>
         <w:numPr>
           <w:ilvl w:val="0"/>
-          <w:numId w:val="3"/>
+          <w:numId w:val="2"/>
         </w:numPr>
         <w:spacing w:after="80"/>
       </w:pPr>
@@ -1105,7 +1319,7 @@
         <w:pStyle w:val="ListParagraph"/>
         <w:numPr>
           <w:ilvl w:val="0"/>
-          <w:numId w:val="3"/>
+          <w:numId w:val="2"/>
         </w:numPr>
         <w:spacing w:after="80"/>
       </w:pPr>
@@ -1124,7 +1338,7 @@
         <w:pStyle w:val="ListParagraph"/>
         <w:numPr>
           <w:ilvl w:val="0"/>
-          <w:numId w:val="3"/>
+          <w:numId w:val="2"/>
         </w:numPr>
         <w:spacing w:after="80"/>
       </w:pPr>
@@ -1169,7 +1383,7 @@
           <w:sz w:val="32"/>
           <w:szCs w:val="32"/>
         </w:rPr>
-        <w:t xml:space="preserve">4. Crear una misión nueva</w:t>
+        <w:t xml:space="preserve">4. Tus misiones</w:t>
       </w:r>
     </w:p>
     <w:p>
@@ -1183,7 +1397,7 @@
           <w:sz w:val="22"/>
           <w:szCs w:val="22"/>
         </w:rPr>
-        <w:t xml:space="preserve">Pestaña Misiones → botón Nueva misión</w:t>
+        <w:t xml:space="preserve">En la pestaña Misiones solo verás las que el coordinador o el administrador te ha asignado. Las del resto del operador no aparecen.</w:t>
       </w:r>
     </w:p>
     <w:p>
@@ -1200,252 +1414,177 @@
           <w:sz w:val="22"/>
           <w:szCs w:val="22"/>
         </w:rPr>
-        <w:t xml:space="preserve">Campos obligatorios:</w:t>
-      </w:r>
-    </w:p>
-    <w:p>
-      <w:pPr>
-        <w:pStyle w:val="ListParagraph"/>
-        <w:numPr>
-          <w:ilvl w:val="0"/>
-          <w:numId w:val="3"/>
-        </w:numPr>
-        <w:spacing w:after="80"/>
+        <w:t xml:space="preserve">Lo que SÍ puedes hacer en tus misiones:</w:t>
+      </w:r>
+    </w:p>
+    <w:p>
+      <w:pPr>
+        <w:pStyle w:val="ListParagraph"/>
+        <w:numPr>
+          <w:ilvl w:val="0"/>
+          <w:numId w:val="2"/>
+        </w:numPr>
+        <w:spacing w:after="80"/>
+      </w:pPr>
+      <w:r>
+        <w:rPr>
+          <w:rFonts w:ascii="Arial" w:cs="Arial" w:eastAsia="Arial" w:hAnsi="Arial"/>
+          <w:color w:val="1A2433"/>
+          <w:sz w:val="22"/>
+          <w:szCs w:val="22"/>
+        </w:rPr>
+        <w:t xml:space="preserve">Verlas en lista o mapa</w:t>
+      </w:r>
+    </w:p>
+    <w:p>
+      <w:pPr>
+        <w:pStyle w:val="ListParagraph"/>
+        <w:numPr>
+          <w:ilvl w:val="0"/>
+          <w:numId w:val="2"/>
+        </w:numPr>
+        <w:spacing w:after="80"/>
+      </w:pPr>
+      <w:r>
+        <w:rPr>
+          <w:rFonts w:ascii="Arial" w:cs="Arial" w:eastAsia="Arial" w:hAnsi="Arial"/>
+          <w:color w:val="1A2433"/>
+          <w:sz w:val="22"/>
+          <w:szCs w:val="22"/>
+        </w:rPr>
+        <w:t xml:space="preserve">Cambiar el estado de tu misión (preflight → in_flight → completed)</w:t>
+      </w:r>
+    </w:p>
+    <w:p>
+      <w:pPr>
+        <w:pStyle w:val="ListParagraph"/>
+        <w:numPr>
+          <w:ilvl w:val="0"/>
+          <w:numId w:val="2"/>
+        </w:numPr>
+        <w:spacing w:after="80"/>
+      </w:pPr>
+      <w:r>
+        <w:rPr>
+          <w:rFonts w:ascii="Arial" w:cs="Arial" w:eastAsia="Arial" w:hAnsi="Arial"/>
+          <w:color w:val="1A2433"/>
+          <w:sz w:val="22"/>
+          <w:szCs w:val="22"/>
+        </w:rPr>
+        <w:t xml:space="preserve">Firmar los formularios A.4 a A.8</w:t>
+      </w:r>
+    </w:p>
+    <w:p>
+      <w:pPr>
+        <w:pStyle w:val="ListParagraph"/>
+        <w:numPr>
+          <w:ilvl w:val="0"/>
+          <w:numId w:val="2"/>
+        </w:numPr>
+        <w:spacing w:after="80"/>
+      </w:pPr>
+      <w:r>
+        <w:rPr>
+          <w:rFonts w:ascii="Arial" w:cs="Arial" w:eastAsia="Arial" w:hAnsi="Arial"/>
+          <w:color w:val="1A2433"/>
+          <w:sz w:val="22"/>
+          <w:szCs w:val="22"/>
+        </w:rPr>
+        <w:t xml:space="preserve">Generar el PDF dossier final</w:t>
+      </w:r>
+    </w:p>
+    <w:p>
+      <w:pPr>
+        <w:pStyle w:val="Heading3"/>
+        <w:spacing w:after="100" w:before="200"/>
       </w:pPr>
       <w:r>
         <w:rPr>
           <w:rFonts w:ascii="Arial" w:cs="Arial" w:eastAsia="Arial" w:hAnsi="Arial"/>
           <w:b/>
           <w:bCs/>
-          <w:color w:val="1A2433"/>
-          <w:sz w:val="22"/>
-          <w:szCs w:val="22"/>
-        </w:rPr>
-        <w:t xml:space="preserve">Nombre</w:t>
-      </w:r>
-      <w:r>
-        <w:rPr>
-          <w:rFonts w:ascii="Arial" w:cs="Arial" w:eastAsia="Arial" w:hAnsi="Arial"/>
-          <w:color w:val="1A2433"/>
-          <w:sz w:val="22"/>
-          <w:szCs w:val="22"/>
-        </w:rPr>
-        <w:t xml:space="preserve"> — descriptivo, ej "Inspección torre subestación Mérida"</w:t>
-      </w:r>
-    </w:p>
-    <w:p>
-      <w:pPr>
-        <w:pStyle w:val="ListParagraph"/>
-        <w:numPr>
-          <w:ilvl w:val="0"/>
-          <w:numId w:val="3"/>
-        </w:numPr>
-        <w:spacing w:after="80"/>
-      </w:pPr>
-      <w:r>
-        <w:rPr>
-          <w:rFonts w:ascii="Arial" w:cs="Arial" w:eastAsia="Arial" w:hAnsi="Arial"/>
-          <w:b/>
-          <w:bCs/>
-          <w:color w:val="1A2433"/>
-          <w:sz w:val="22"/>
-          <w:szCs w:val="22"/>
-        </w:rPr>
-        <w:t xml:space="preserve">Prioridad</w:t>
-      </w:r>
-      <w:r>
-        <w:rPr>
-          <w:rFonts w:ascii="Arial" w:cs="Arial" w:eastAsia="Arial" w:hAnsi="Arial"/>
-          <w:color w:val="1A2433"/>
-          <w:sz w:val="22"/>
-          <w:szCs w:val="22"/>
-        </w:rPr>
-        <w:t xml:space="preserve"> — low / medium / high / critical</w:t>
-      </w:r>
-    </w:p>
-    <w:p>
-      <w:pPr>
-        <w:pStyle w:val="ListParagraph"/>
-        <w:numPr>
-          <w:ilvl w:val="0"/>
-          <w:numId w:val="3"/>
-        </w:numPr>
-        <w:spacing w:after="80"/>
-      </w:pPr>
-      <w:r>
-        <w:rPr>
-          <w:rFonts w:ascii="Arial" w:cs="Arial" w:eastAsia="Arial" w:hAnsi="Arial"/>
-          <w:b/>
-          <w:bCs/>
-          <w:color w:val="1A2433"/>
-          <w:sz w:val="22"/>
-          <w:szCs w:val="22"/>
-        </w:rPr>
-        <w:t xml:space="preserve">Drone</w:t>
-      </w:r>
-      <w:r>
-        <w:rPr>
-          <w:rFonts w:ascii="Arial" w:cs="Arial" w:eastAsia="Arial" w:hAnsi="Arial"/>
-          <w:color w:val="1A2433"/>
-          <w:sz w:val="22"/>
-          <w:szCs w:val="22"/>
-        </w:rPr>
-        <w:t xml:space="preserve"> — selector con tu flota disponible</w:t>
-      </w:r>
-    </w:p>
-    <w:p>
-      <w:pPr>
-        <w:pStyle w:val="ListParagraph"/>
-        <w:numPr>
-          <w:ilvl w:val="0"/>
-          <w:numId w:val="3"/>
-        </w:numPr>
-        <w:spacing w:after="80"/>
-      </w:pPr>
-      <w:r>
-        <w:rPr>
-          <w:rFonts w:ascii="Arial" w:cs="Arial" w:eastAsia="Arial" w:hAnsi="Arial"/>
-          <w:b/>
-          <w:bCs/>
-          <w:color w:val="1A2433"/>
-          <w:sz w:val="22"/>
-          <w:szCs w:val="22"/>
-        </w:rPr>
-        <w:t xml:space="preserve">Piloto</w:t>
-      </w:r>
-      <w:r>
-        <w:rPr>
-          <w:rFonts w:ascii="Arial" w:cs="Arial" w:eastAsia="Arial" w:hAnsi="Arial"/>
-          <w:color w:val="1A2433"/>
-          <w:sz w:val="22"/>
-          <w:szCs w:val="22"/>
-        </w:rPr>
-        <w:t xml:space="preserve"> — selector con pilotos certificados</w:t>
-      </w:r>
-    </w:p>
-    <w:p>
-      <w:pPr>
-        <w:pStyle w:val="ListParagraph"/>
-        <w:numPr>
-          <w:ilvl w:val="0"/>
-          <w:numId w:val="3"/>
-        </w:numPr>
-        <w:spacing w:after="80"/>
-      </w:pPr>
-      <w:r>
-        <w:rPr>
-          <w:rFonts w:ascii="Arial" w:cs="Arial" w:eastAsia="Arial" w:hAnsi="Arial"/>
-          <w:b/>
-          <w:bCs/>
-          <w:color w:val="1A2433"/>
-          <w:sz w:val="22"/>
-          <w:szCs w:val="22"/>
-        </w:rPr>
-        <w:t xml:space="preserve">Fecha/hora programada</w:t>
-      </w:r>
-    </w:p>
-    <w:p>
-      <w:pPr>
-        <w:pStyle w:val="ListParagraph"/>
-        <w:numPr>
-          <w:ilvl w:val="0"/>
-          <w:numId w:val="3"/>
-        </w:numPr>
-        <w:spacing w:after="80"/>
-      </w:pPr>
-      <w:r>
-        <w:rPr>
-          <w:rFonts w:ascii="Arial" w:cs="Arial" w:eastAsia="Arial" w:hAnsi="Arial"/>
-          <w:b/>
-          <w:bCs/>
-          <w:color w:val="1A2433"/>
-          <w:sz w:val="22"/>
-          <w:szCs w:val="22"/>
-        </w:rPr>
-        <w:t xml:space="preserve">Coordenadas</w:t>
-      </w:r>
-      <w:r>
-        <w:rPr>
-          <w:rFonts w:ascii="Arial" w:cs="Arial" w:eastAsia="Arial" w:hAnsi="Arial"/>
-          <w:color w:val="1A2433"/>
-          <w:sz w:val="22"/>
-          <w:szCs w:val="22"/>
-        </w:rPr>
-        <w:t xml:space="preserve"> (lat / lng) — opcional pero recomendado para que aparezca en el mapa</w:t>
-      </w:r>
-    </w:p>
-    <w:p>
-      <w:pPr>
-        <w:pStyle w:val="ListParagraph"/>
-        <w:numPr>
-          <w:ilvl w:val="0"/>
-          <w:numId w:val="3"/>
-        </w:numPr>
-        <w:spacing w:after="80"/>
-      </w:pPr>
-      <w:r>
-        <w:rPr>
-          <w:rFonts w:ascii="Arial" w:cs="Arial" w:eastAsia="Arial" w:hAnsi="Arial"/>
-          <w:b/>
-          <w:bCs/>
-          <w:color w:val="1A2433"/>
-          <w:sz w:val="22"/>
-          <w:szCs w:val="22"/>
-        </w:rPr>
-        <w:t xml:space="preserve">Altitud máxima</w:t>
-      </w:r>
-      <w:r>
-        <w:rPr>
-          <w:rFonts w:ascii="Arial" w:cs="Arial" w:eastAsia="Arial" w:hAnsi="Arial"/>
-          <w:color w:val="1A2433"/>
-          <w:sz w:val="22"/>
-          <w:szCs w:val="22"/>
-        </w:rPr>
-        <w:t xml:space="preserve"> — en metros AGL</w:t>
-      </w:r>
-    </w:p>
-    <w:p>
-      <w:pPr>
-        <w:pStyle w:val="ListParagraph"/>
-        <w:numPr>
-          <w:ilvl w:val="0"/>
-          <w:numId w:val="3"/>
-        </w:numPr>
-        <w:spacing w:after="80"/>
-      </w:pPr>
-      <w:r>
-        <w:rPr>
-          <w:rFonts w:ascii="Arial" w:cs="Arial" w:eastAsia="Arial" w:hAnsi="Arial"/>
-          <w:b/>
-          <w:bCs/>
-          <w:color w:val="1A2433"/>
-          <w:sz w:val="22"/>
-          <w:szCs w:val="22"/>
-        </w:rPr>
-        <w:t xml:space="preserve">Clase SORA</w:t>
-      </w:r>
-      <w:r>
-        <w:rPr>
-          <w:rFonts w:ascii="Arial" w:cs="Arial" w:eastAsia="Arial" w:hAnsi="Arial"/>
-          <w:color w:val="1A2433"/>
-          <w:sz w:val="22"/>
-          <w:szCs w:val="22"/>
-        </w:rPr>
-        <w:t xml:space="preserve"> — STS-01 / STS-02 / específica</w:t>
-      </w:r>
-    </w:p>
-    <w:p>
-      <w:pPr>
-        <w:spacing w:after="120" w:line="300"/>
-      </w:pPr>
-      <w:r>
-        <w:rPr>
-          <w:rFonts w:ascii="Arial" w:cs="Arial" w:eastAsia="Arial" w:hAnsi="Arial"/>
-          <w:color w:val="1A2433"/>
-          <w:sz w:val="22"/>
-          <w:szCs w:val="22"/>
-        </w:rPr>
-        <w:t xml:space="preserve">El código SKY-2026-XXX se genera automáticamente al guardar. La misión nace en estado draft.</w:t>
+          <w:color w:val="0D1520"/>
+          <w:sz w:val="22"/>
+          <w:szCs w:val="22"/>
+        </w:rPr>
+        <w:t xml:space="preserve">Lo que NO puedes hacer:</w:t>
+      </w:r>
+    </w:p>
+    <w:p>
+      <w:pPr>
+        <w:pStyle w:val="ListParagraph"/>
+        <w:numPr>
+          <w:ilvl w:val="0"/>
+          <w:numId w:val="2"/>
+        </w:numPr>
+        <w:spacing w:after="80"/>
+      </w:pPr>
+      <w:r>
+        <w:rPr>
+          <w:rFonts w:ascii="Arial" w:cs="Arial" w:eastAsia="Arial" w:hAnsi="Arial"/>
+          <w:color w:val="1A2433"/>
+          <w:sz w:val="22"/>
+          <w:szCs w:val="22"/>
+        </w:rPr>
+        <w:t xml:space="preserve">Crear misiones nuevas (las crea Luis o el coordinador)</w:t>
+      </w:r>
+    </w:p>
+    <w:p>
+      <w:pPr>
+        <w:pStyle w:val="ListParagraph"/>
+        <w:numPr>
+          <w:ilvl w:val="0"/>
+          <w:numId w:val="2"/>
+        </w:numPr>
+        <w:spacing w:after="80"/>
+      </w:pPr>
+      <w:r>
+        <w:rPr>
+          <w:rFonts w:ascii="Arial" w:cs="Arial" w:eastAsia="Arial" w:hAnsi="Arial"/>
+          <w:color w:val="1A2433"/>
+          <w:sz w:val="22"/>
+          <w:szCs w:val="22"/>
+        </w:rPr>
+        <w:t xml:space="preserve">Borrar misiones (solo admin)</w:t>
+      </w:r>
+    </w:p>
+    <w:p>
+      <w:pPr>
+        <w:pStyle w:val="ListParagraph"/>
+        <w:numPr>
+          <w:ilvl w:val="0"/>
+          <w:numId w:val="2"/>
+        </w:numPr>
+        <w:spacing w:after="80"/>
+      </w:pPr>
+      <w:r>
+        <w:rPr>
+          <w:rFonts w:ascii="Arial" w:cs="Arial" w:eastAsia="Arial" w:hAnsi="Arial"/>
+          <w:color w:val="1A2433"/>
+          <w:sz w:val="22"/>
+          <w:szCs w:val="22"/>
+        </w:rPr>
+        <w:t xml:space="preserve">Editar campos básicos como nombre, drone, fechas (solo coordinador+)</w:t>
+      </w:r>
+    </w:p>
+    <w:p>
+      <w:pPr>
+        <w:pBdr>
+          <w:left w:val="single" w:color="F04E1C" w:sz="18" w:space="12"/>
+        </w:pBdr>
+        <w:spacing w:after="120" w:before="120"/>
+        <w:ind w:left="360"/>
+      </w:pPr>
+      <w:r>
+        <w:rPr>
+          <w:rFonts w:ascii="Arial" w:cs="Arial" w:eastAsia="Arial" w:hAnsi="Arial"/>
+          <w:i/>
+          <w:iCs/>
+          <w:color w:val="5A7A9A"/>
+          <w:sz w:val="22"/>
+          <w:szCs w:val="22"/>
+        </w:rPr>
+        <w:t xml:space="preserve">Si necesitas crear una misión nueva o cambiar drone/piloto, dile a Luis (admin) o al coordinador.</w:t>
       </w:r>
     </w:p>
     <w:p>
@@ -1465,7 +1604,7 @@
           <w:sz w:val="32"/>
           <w:szCs w:val="32"/>
         </w:rPr>
-        <w:t xml:space="preserve">5. Estados de misión y transiciones</w:t>
+        <w:t xml:space="preserve">5. Estados de misión</w:t>
       </w:r>
     </w:p>
     <w:p>
@@ -1653,7 +1792,7 @@
                 <w:sz w:val="20"/>
                 <w:szCs w:val="20"/>
               </w:rPr>
-              <w:t xml:space="preserve">Recién creada, editable libremente</w:t>
+              <w:t xml:space="preserve">Recién creada por coordinador, editable libremente</w:t>
             </w:r>
           </w:p>
         </w:tc>
@@ -1777,7 +1916,7 @@
                 <w:sz w:val="20"/>
                 <w:szCs w:val="20"/>
               </w:rPr>
-              <w:t xml:space="preserve">Lista para volar</w:t>
+              <w:t xml:space="preserve">Lista para volar — te llega email</w:t>
             </w:r>
           </w:p>
         </w:tc>
@@ -1839,7 +1978,7 @@
                 <w:sz w:val="20"/>
                 <w:szCs w:val="20"/>
               </w:rPr>
-              <w:t xml:space="preserve">Checklist pre-vuelo + AESA A.4 firmado</w:t>
+              <w:t xml:space="preserve">Pasas tú: rellenas A.4 + checklist pre-vuelo + firmas</w:t>
             </w:r>
           </w:p>
         </w:tc>
@@ -1901,7 +2040,7 @@
                 <w:sz w:val="20"/>
                 <w:szCs w:val="20"/>
               </w:rPr>
-              <w:t xml:space="preserve">Drone en el aire — meteo y telemetría activas</w:t>
+              <w:t xml:space="preserve">Pasas tú: drone en el aire — te llega email a Luis</w:t>
             </w:r>
           </w:p>
         </w:tc>
@@ -1963,7 +2102,7 @@
                 <w:sz w:val="20"/>
                 <w:szCs w:val="20"/>
               </w:rPr>
-              <w:t xml:space="preserve">Vuelo terminado + post-flight A.5/A.6 firmado</w:t>
+              <w:t xml:space="preserve">Pasas tú: firmas A.7 post-flight, mision cerrada</w:t>
             </w:r>
           </w:p>
         </w:tc>
@@ -2025,7 +2164,7 @@
                 <w:sz w:val="20"/>
                 <w:szCs w:val="20"/>
               </w:rPr>
-              <w:t xml:space="preserve">Misión cortada en vuelo (incidente A.8)</w:t>
+              <w:t xml:space="preserve">Misión cortada en vuelo — incidente A.8 obligatorio</w:t>
             </w:r>
           </w:p>
         </w:tc>
@@ -2087,7 +2226,7 @@
                 <w:sz w:val="20"/>
                 <w:szCs w:val="20"/>
               </w:rPr>
-              <w:t xml:space="preserve">No se ejecutó (motivo libre)</w:t>
+              <w:t xml:space="preserve">No se ejecutó (motivo libre, lo hace coordinador)</w:t>
             </w:r>
           </w:p>
         </w:tc>
@@ -2110,7 +2249,7 @@
           <w:sz w:val="22"/>
           <w:szCs w:val="22"/>
         </w:rPr>
-        <w:t xml:space="preserve">No puedes saltar estados. El sistema valida cada transición. Para pasar a in_flight la misión debe tener drone + piloto asignados y el A.4 firmado.</w:t>
+        <w:t xml:space="preserve">Cada cambio de estado importante te dispara un email a ti y a Luis (administrador).</w:t>
       </w:r>
     </w:p>
     <w:p>
@@ -2169,56 +2308,45 @@
         <w:pStyle w:val="ListParagraph"/>
         <w:numPr>
           <w:ilvl w:val="0"/>
-          <w:numId w:val="3"/>
-        </w:numPr>
-        <w:spacing w:after="80"/>
-      </w:pPr>
-      <w:r>
-        <w:rPr>
-          <w:rFonts w:ascii="Arial" w:cs="Arial" w:eastAsia="Arial" w:hAnsi="Arial"/>
-          <w:color w:val="1A2433"/>
-          <w:sz w:val="22"/>
-          <w:szCs w:val="22"/>
-        </w:rPr>
-        <w:t xml:space="preserve">Análisis de la zona, riesgos, espacios aéreos</w:t>
-      </w:r>
-    </w:p>
-    <w:p>
-      <w:pPr>
-        <w:pStyle w:val="ListParagraph"/>
-        <w:numPr>
-          <w:ilvl w:val="0"/>
-          <w:numId w:val="3"/>
-        </w:numPr>
-        <w:spacing w:after="80"/>
-      </w:pPr>
-      <w:r>
-        <w:rPr>
-          <w:rFonts w:ascii="Arial" w:cs="Arial" w:eastAsia="Arial" w:hAnsi="Arial"/>
-          <w:b/>
-          <w:bCs/>
-          <w:color w:val="1A2433"/>
-          <w:sz w:val="22"/>
-          <w:szCs w:val="22"/>
-        </w:rPr>
-        <w:t xml:space="preserve">Firma digital del piloto</w:t>
-      </w:r>
-      <w:r>
-        <w:rPr>
-          <w:rFonts w:ascii="Arial" w:cs="Arial" w:eastAsia="Arial" w:hAnsi="Arial"/>
-          <w:color w:val="1A2433"/>
-          <w:sz w:val="22"/>
-          <w:szCs w:val="22"/>
-        </w:rPr>
-        <w:t xml:space="preserve"> — pad táctil, firma en pantalla</w:t>
-      </w:r>
-    </w:p>
-    <w:p>
-      <w:pPr>
-        <w:pStyle w:val="ListParagraph"/>
-        <w:numPr>
-          <w:ilvl w:val="0"/>
-          <w:numId w:val="3"/>
+          <w:numId w:val="2"/>
+        </w:numPr>
+        <w:spacing w:after="80"/>
+      </w:pPr>
+      <w:r>
+        <w:rPr>
+          <w:rFonts w:ascii="Arial" w:cs="Arial" w:eastAsia="Arial" w:hAnsi="Arial"/>
+          <w:color w:val="1A2433"/>
+          <w:sz w:val="22"/>
+          <w:szCs w:val="22"/>
+        </w:rPr>
+        <w:t xml:space="preserve">Análisis de zona, riesgos, espacios aéreos</w:t>
+      </w:r>
+    </w:p>
+    <w:p>
+      <w:pPr>
+        <w:pStyle w:val="ListParagraph"/>
+        <w:numPr>
+          <w:ilvl w:val="0"/>
+          <w:numId w:val="2"/>
+        </w:numPr>
+        <w:spacing w:after="80"/>
+      </w:pPr>
+      <w:r>
+        <w:rPr>
+          <w:rFonts w:ascii="Arial" w:cs="Arial" w:eastAsia="Arial" w:hAnsi="Arial"/>
+          <w:color w:val="1A2433"/>
+          <w:sz w:val="22"/>
+          <w:szCs w:val="22"/>
+        </w:rPr>
+        <w:t xml:space="preserve">Firma digital del piloto (pad táctil en pantalla)</w:t>
+      </w:r>
+    </w:p>
+    <w:p>
+      <w:pPr>
+        <w:pStyle w:val="ListParagraph"/>
+        <w:numPr>
+          <w:ilvl w:val="0"/>
+          <w:numId w:val="2"/>
         </w:numPr>
         <w:spacing w:after="80"/>
       </w:pPr>
@@ -2254,26 +2382,26 @@
         <w:pStyle w:val="ListParagraph"/>
         <w:numPr>
           <w:ilvl w:val="0"/>
-          <w:numId w:val="3"/>
-        </w:numPr>
-        <w:spacing w:after="80"/>
-      </w:pPr>
-      <w:r>
-        <w:rPr>
-          <w:rFonts w:ascii="Arial" w:cs="Arial" w:eastAsia="Arial" w:hAnsi="Arial"/>
-          <w:color w:val="1A2433"/>
-          <w:sz w:val="22"/>
-          <w:szCs w:val="22"/>
-        </w:rPr>
-        <w:t xml:space="preserve">Estado del drone (batería, integridad estructural, cámaras)</w:t>
-      </w:r>
-    </w:p>
-    <w:p>
-      <w:pPr>
-        <w:pStyle w:val="ListParagraph"/>
-        <w:numPr>
-          <w:ilvl w:val="0"/>
-          <w:numId w:val="3"/>
+          <w:numId w:val="2"/>
+        </w:numPr>
+        <w:spacing w:after="80"/>
+      </w:pPr>
+      <w:r>
+        <w:rPr>
+          <w:rFonts w:ascii="Arial" w:cs="Arial" w:eastAsia="Arial" w:hAnsi="Arial"/>
+          <w:color w:val="1A2433"/>
+          <w:sz w:val="22"/>
+          <w:szCs w:val="22"/>
+        </w:rPr>
+        <w:t xml:space="preserve">Estado del drone (batería, integridad, cámaras)</w:t>
+      </w:r>
+    </w:p>
+    <w:p>
+      <w:pPr>
+        <w:pStyle w:val="ListParagraph"/>
+        <w:numPr>
+          <w:ilvl w:val="0"/>
+          <w:numId w:val="2"/>
         </w:numPr>
         <w:spacing w:after="80"/>
       </w:pPr>
@@ -2292,7 +2420,7 @@
         <w:pStyle w:val="ListParagraph"/>
         <w:numPr>
           <w:ilvl w:val="0"/>
-          <w:numId w:val="3"/>
+          <w:numId w:val="2"/>
         </w:numPr>
         <w:spacing w:after="80"/>
       </w:pPr>
@@ -2320,45 +2448,26 @@
           <w:sz w:val="26"/>
           <w:szCs w:val="26"/>
         </w:rPr>
-        <w:t xml:space="preserve">A.6 — Briefing equipo (si hay observador o copiloto)</w:t>
-      </w:r>
-    </w:p>
-    <w:p>
-      <w:pPr>
-        <w:pStyle w:val="ListParagraph"/>
-        <w:numPr>
-          <w:ilvl w:val="0"/>
-          <w:numId w:val="3"/>
-        </w:numPr>
-        <w:spacing w:after="80"/>
-      </w:pPr>
-      <w:r>
-        <w:rPr>
-          <w:rFonts w:ascii="Arial" w:cs="Arial" w:eastAsia="Arial" w:hAnsi="Arial"/>
-          <w:color w:val="1A2433"/>
-          <w:sz w:val="22"/>
-          <w:szCs w:val="22"/>
-        </w:rPr>
-        <w:t xml:space="preserve">Asignación de roles</w:t>
-      </w:r>
-    </w:p>
-    <w:p>
-      <w:pPr>
-        <w:pStyle w:val="ListParagraph"/>
-        <w:numPr>
-          <w:ilvl w:val="0"/>
-          <w:numId w:val="3"/>
-        </w:numPr>
-        <w:spacing w:after="80"/>
-      </w:pPr>
-      <w:r>
-        <w:rPr>
-          <w:rFonts w:ascii="Arial" w:cs="Arial" w:eastAsia="Arial" w:hAnsi="Arial"/>
-          <w:color w:val="1A2433"/>
-          <w:sz w:val="22"/>
-          <w:szCs w:val="22"/>
-        </w:rPr>
-        <w:t xml:space="preserve">Comunicaciones acordadas</w:t>
+        <w:t xml:space="preserve">A.6 — Briefing equipo</w:t>
+      </w:r>
+    </w:p>
+    <w:p>
+      <w:pPr>
+        <w:pStyle w:val="ListParagraph"/>
+        <w:numPr>
+          <w:ilvl w:val="0"/>
+          <w:numId w:val="2"/>
+        </w:numPr>
+        <w:spacing w:after="80"/>
+      </w:pPr>
+      <w:r>
+        <w:rPr>
+          <w:rFonts w:ascii="Arial" w:cs="Arial" w:eastAsia="Arial" w:hAnsi="Arial"/>
+          <w:color w:val="1A2433"/>
+          <w:sz w:val="22"/>
+          <w:szCs w:val="22"/>
+        </w:rPr>
+        <w:t xml:space="preserve">Si hay observador o copiloto: roles + comunicaciones acordadas</w:t>
       </w:r>
     </w:p>
     <w:p>
@@ -2383,56 +2492,37 @@
         <w:pStyle w:val="ListParagraph"/>
         <w:numPr>
           <w:ilvl w:val="0"/>
-          <w:numId w:val="3"/>
-        </w:numPr>
-        <w:spacing w:after="80"/>
-      </w:pPr>
-      <w:r>
-        <w:rPr>
-          <w:rFonts w:ascii="Arial" w:cs="Arial" w:eastAsia="Arial" w:hAnsi="Arial"/>
-          <w:color w:val="1A2433"/>
-          <w:sz w:val="22"/>
-          <w:szCs w:val="22"/>
-        </w:rPr>
-        <w:t xml:space="preserve">Horas voladas</w:t>
-      </w:r>
-    </w:p>
-    <w:p>
-      <w:pPr>
-        <w:pStyle w:val="ListParagraph"/>
-        <w:numPr>
-          <w:ilvl w:val="0"/>
-          <w:numId w:val="3"/>
-        </w:numPr>
-        <w:spacing w:after="80"/>
-      </w:pPr>
-      <w:r>
-        <w:rPr>
-          <w:rFonts w:ascii="Arial" w:cs="Arial" w:eastAsia="Arial" w:hAnsi="Arial"/>
-          <w:color w:val="1A2433"/>
-          <w:sz w:val="22"/>
-          <w:szCs w:val="22"/>
-        </w:rPr>
-        <w:t xml:space="preserve">Incidencias menores (campo libre)</w:t>
-      </w:r>
-    </w:p>
-    <w:p>
-      <w:pPr>
-        <w:pStyle w:val="ListParagraph"/>
-        <w:numPr>
-          <w:ilvl w:val="0"/>
-          <w:numId w:val="3"/>
-        </w:numPr>
-        <w:spacing w:after="80"/>
-      </w:pPr>
-      <w:r>
-        <w:rPr>
-          <w:rFonts w:ascii="Arial" w:cs="Arial" w:eastAsia="Arial" w:hAnsi="Arial"/>
-          <w:color w:val="1A2433"/>
-          <w:sz w:val="22"/>
-          <w:szCs w:val="22"/>
-        </w:rPr>
-        <w:t xml:space="preserve">Estado final del drone (devuelto a hangar OK / requiere mantenimiento)</w:t>
+          <w:numId w:val="2"/>
+        </w:numPr>
+        <w:spacing w:after="80"/>
+      </w:pPr>
+      <w:r>
+        <w:rPr>
+          <w:rFonts w:ascii="Arial" w:cs="Arial" w:eastAsia="Arial" w:hAnsi="Arial"/>
+          <w:color w:val="1A2433"/>
+          <w:sz w:val="22"/>
+          <w:szCs w:val="22"/>
+        </w:rPr>
+        <w:t xml:space="preserve">Horas voladas + incidencias menores</w:t>
+      </w:r>
+    </w:p>
+    <w:p>
+      <w:pPr>
+        <w:pStyle w:val="ListParagraph"/>
+        <w:numPr>
+          <w:ilvl w:val="0"/>
+          <w:numId w:val="2"/>
+        </w:numPr>
+        <w:spacing w:after="80"/>
+      </w:pPr>
+      <w:r>
+        <w:rPr>
+          <w:rFonts w:ascii="Arial" w:cs="Arial" w:eastAsia="Arial" w:hAnsi="Arial"/>
+          <w:color w:val="1A2433"/>
+          <w:sz w:val="22"/>
+          <w:szCs w:val="22"/>
+        </w:rPr>
+        <w:t xml:space="preserve">Estado final del drone</w:t>
       </w:r>
     </w:p>
     <w:p>
@@ -2449,34 +2539,34 @@
           <w:sz w:val="26"/>
           <w:szCs w:val="26"/>
         </w:rPr>
-        <w:t xml:space="preserve">A.8 — Reporte de incidente (solo si aplica)</w:t>
-      </w:r>
-    </w:p>
-    <w:p>
-      <w:pPr>
-        <w:pStyle w:val="ListParagraph"/>
-        <w:numPr>
-          <w:ilvl w:val="0"/>
-          <w:numId w:val="3"/>
-        </w:numPr>
-        <w:spacing w:after="80"/>
-      </w:pPr>
-      <w:r>
-        <w:rPr>
-          <w:rFonts w:ascii="Arial" w:cs="Arial" w:eastAsia="Arial" w:hAnsi="Arial"/>
-          <w:color w:val="1A2433"/>
-          <w:sz w:val="22"/>
-          <w:szCs w:val="22"/>
-        </w:rPr>
-        <w:t xml:space="preserve">Si el vuelo se aborta o hay incidente</w:t>
-      </w:r>
-    </w:p>
-    <w:p>
-      <w:pPr>
-        <w:pStyle w:val="ListParagraph"/>
-        <w:numPr>
-          <w:ilvl w:val="0"/>
-          <w:numId w:val="3"/>
+        <w:t xml:space="preserve">A.8 — Reporte de incidente</w:t>
+      </w:r>
+    </w:p>
+    <w:p>
+      <w:pPr>
+        <w:pStyle w:val="ListParagraph"/>
+        <w:numPr>
+          <w:ilvl w:val="0"/>
+          <w:numId w:val="2"/>
+        </w:numPr>
+        <w:spacing w:after="80"/>
+      </w:pPr>
+      <w:r>
+        <w:rPr>
+          <w:rFonts w:ascii="Arial" w:cs="Arial" w:eastAsia="Arial" w:hAnsi="Arial"/>
+          <w:color w:val="1A2433"/>
+          <w:sz w:val="22"/>
+          <w:szCs w:val="22"/>
+        </w:rPr>
+        <w:t xml:space="preserve">Solo si el vuelo se aborta o hay incidente</w:t>
+      </w:r>
+    </w:p>
+    <w:p>
+      <w:pPr>
+        <w:pStyle w:val="ListParagraph"/>
+        <w:numPr>
+          <w:ilvl w:val="0"/>
+          <w:numId w:val="2"/>
         </w:numPr>
         <w:spacing w:after="80"/>
       </w:pPr>
@@ -2492,19 +2582,519 @@
     </w:p>
     <w:p>
       <w:pPr>
-        <w:pStyle w:val="Heading2"/>
-        <w:spacing w:after="140" w:before="280"/>
+        <w:pStyle w:val="Heading1"/>
+        <w:pBdr>
+          <w:bottom w:val="single" w:color="0C9FD8" w:sz="12" w:space="4"/>
+        </w:pBdr>
+        <w:spacing w:after="200" w:before="360"/>
       </w:pPr>
       <w:r>
         <w:rPr>
           <w:rFonts w:ascii="Arial" w:cs="Arial" w:eastAsia="Arial" w:hAnsi="Arial"/>
           <w:b/>
           <w:bCs/>
-          <w:color w:val="0C9FD8"/>
-          <w:sz w:val="26"/>
-          <w:szCs w:val="26"/>
-        </w:rPr>
-        <w:t xml:space="preserve">Anexo I — Manual de operaciones aplicable</w:t>
+          <w:color w:val="0D1520"/>
+          <w:sz w:val="32"/>
+          <w:szCs w:val="32"/>
+        </w:rPr>
+        <w:t xml:space="preserve">7. PDF dossier — el entregable AESA</w:t>
+      </w:r>
+    </w:p>
+    <w:p>
+      <w:pPr>
+        <w:spacing w:after="120" w:line="300"/>
+      </w:pPr>
+      <w:r>
+        <w:rPr>
+          <w:rFonts w:ascii="Arial" w:cs="Arial" w:eastAsia="Arial" w:hAnsi="Arial"/>
+          <w:color w:val="1A2433"/>
+          <w:sz w:val="22"/>
+          <w:szCs w:val="22"/>
+        </w:rPr>
+        <w:t xml:space="preserve">Una vez completados los formularios:</w:t>
+      </w:r>
+    </w:p>
+    <w:p>
+      <w:pPr>
+        <w:spacing w:after="120" w:line="300"/>
+      </w:pPr>
+      <w:r>
+        <w:rPr>
+          <w:rFonts w:ascii="Arial" w:cs="Arial" w:eastAsia="Arial" w:hAnsi="Arial"/>
+          <w:color w:val="1A2433"/>
+          <w:sz w:val="22"/>
+          <w:szCs w:val="22"/>
+        </w:rPr>
+        <w:t xml:space="preserve">Compliance → botón Generar dossier PDF</w:t>
+      </w:r>
+    </w:p>
+    <w:p>
+      <w:pPr>
+        <w:pStyle w:val="Heading3"/>
+        <w:spacing w:after="100" w:before="200"/>
+      </w:pPr>
+      <w:r>
+        <w:rPr>
+          <w:rFonts w:ascii="Arial" w:cs="Arial" w:eastAsia="Arial" w:hAnsi="Arial"/>
+          <w:b/>
+          <w:bCs/>
+          <w:color w:val="0D1520"/>
+          <w:sz w:val="22"/>
+          <w:szCs w:val="22"/>
+        </w:rPr>
+        <w:t xml:space="preserve">Sale un PDF único con (v1.1):</w:t>
+      </w:r>
+    </w:p>
+    <w:p>
+      <w:pPr>
+        <w:pStyle w:val="ListParagraph"/>
+        <w:numPr>
+          <w:ilvl w:val="0"/>
+          <w:numId w:val="2"/>
+        </w:numPr>
+        <w:spacing w:after="80"/>
+      </w:pPr>
+      <w:r>
+        <w:rPr>
+          <w:rFonts w:ascii="Arial" w:cs="Arial" w:eastAsia="Arial" w:hAnsi="Arial"/>
+          <w:color w:val="1A2433"/>
+          <w:sz w:val="22"/>
+          <w:szCs w:val="22"/>
+        </w:rPr>
+        <w:t xml:space="preserve">Cabecera AESA: nombre, NIF, registro operador, CSV verificación</w:t>
+      </w:r>
+    </w:p>
+    <w:p>
+      <w:pPr>
+        <w:pStyle w:val="ListParagraph"/>
+        <w:numPr>
+          <w:ilvl w:val="0"/>
+          <w:numId w:val="2"/>
+        </w:numPr>
+        <w:spacing w:after="80"/>
+      </w:pPr>
+      <w:r>
+        <w:rPr>
+          <w:rFonts w:ascii="Arial" w:cs="Arial" w:eastAsia="Arial" w:hAnsi="Arial"/>
+          <w:color w:val="1A2433"/>
+          <w:sz w:val="22"/>
+          <w:szCs w:val="22"/>
+        </w:rPr>
+        <w:t xml:space="preserve">Datos de la misión (código, fechas, ubicación, drone, piloto)</w:t>
+      </w:r>
+    </w:p>
+    <w:p>
+      <w:pPr>
+        <w:pStyle w:val="ListParagraph"/>
+        <w:numPr>
+          <w:ilvl w:val="0"/>
+          <w:numId w:val="2"/>
+        </w:numPr>
+        <w:spacing w:after="80"/>
+      </w:pPr>
+      <w:r>
+        <w:rPr>
+          <w:rFonts w:ascii="Arial" w:cs="Arial" w:eastAsia="Arial" w:hAnsi="Arial"/>
+          <w:color w:val="1A2433"/>
+          <w:sz w:val="22"/>
+          <w:szCs w:val="22"/>
+        </w:rPr>
+        <w:t xml:space="preserve">A.4 + firma piloto</w:t>
+      </w:r>
+    </w:p>
+    <w:p>
+      <w:pPr>
+        <w:pStyle w:val="ListParagraph"/>
+        <w:numPr>
+          <w:ilvl w:val="0"/>
+          <w:numId w:val="2"/>
+        </w:numPr>
+        <w:spacing w:after="80"/>
+      </w:pPr>
+      <w:r>
+        <w:rPr>
+          <w:rFonts w:ascii="Arial" w:cs="Arial" w:eastAsia="Arial" w:hAnsi="Arial"/>
+          <w:color w:val="1A2433"/>
+          <w:sz w:val="22"/>
+          <w:szCs w:val="22"/>
+        </w:rPr>
+        <w:t xml:space="preserve">A.5 + firma piloto</w:t>
+      </w:r>
+    </w:p>
+    <w:p>
+      <w:pPr>
+        <w:pStyle w:val="ListParagraph"/>
+        <w:numPr>
+          <w:ilvl w:val="0"/>
+          <w:numId w:val="2"/>
+        </w:numPr>
+        <w:spacing w:after="80"/>
+      </w:pPr>
+      <w:r>
+        <w:rPr>
+          <w:rFonts w:ascii="Arial" w:cs="Arial" w:eastAsia="Arial" w:hAnsi="Arial"/>
+          <w:color w:val="1A2433"/>
+          <w:sz w:val="22"/>
+          <w:szCs w:val="22"/>
+        </w:rPr>
+        <w:t xml:space="preserve">A.6 (si aplica)</w:t>
+      </w:r>
+    </w:p>
+    <w:p>
+      <w:pPr>
+        <w:pStyle w:val="ListParagraph"/>
+        <w:numPr>
+          <w:ilvl w:val="0"/>
+          <w:numId w:val="2"/>
+        </w:numPr>
+        <w:spacing w:after="80"/>
+      </w:pPr>
+      <w:r>
+        <w:rPr>
+          <w:rFonts w:ascii="Arial" w:cs="Arial" w:eastAsia="Arial" w:hAnsi="Arial"/>
+          <w:color w:val="1A2433"/>
+          <w:sz w:val="22"/>
+          <w:szCs w:val="22"/>
+        </w:rPr>
+        <w:t xml:space="preserve">A.7 + horas voladas</w:t>
+      </w:r>
+    </w:p>
+    <w:p>
+      <w:pPr>
+        <w:pStyle w:val="ListParagraph"/>
+        <w:numPr>
+          <w:ilvl w:val="0"/>
+          <w:numId w:val="2"/>
+        </w:numPr>
+        <w:spacing w:after="80"/>
+      </w:pPr>
+      <w:r>
+        <w:rPr>
+          <w:rFonts w:ascii="Arial" w:cs="Arial" w:eastAsia="Arial" w:hAnsi="Arial"/>
+          <w:color w:val="1A2433"/>
+          <w:sz w:val="22"/>
+          <w:szCs w:val="22"/>
+        </w:rPr>
+        <w:t xml:space="preserve">A.8 (si aplica)</w:t>
+      </w:r>
+    </w:p>
+    <w:p>
+      <w:pPr>
+        <w:pStyle w:val="ListParagraph"/>
+        <w:numPr>
+          <w:ilvl w:val="0"/>
+          <w:numId w:val="2"/>
+        </w:numPr>
+        <w:spacing w:after="80"/>
+      </w:pPr>
+      <w:r>
+        <w:rPr>
+          <w:rFonts w:ascii="Arial" w:cs="Arial" w:eastAsia="Arial" w:hAnsi="Arial"/>
+          <w:color w:val="1A2433"/>
+          <w:sz w:val="22"/>
+          <w:szCs w:val="22"/>
+        </w:rPr>
+        <w:t xml:space="preserve">Footer en cada página con código + registro AESA</w:t>
+      </w:r>
+    </w:p>
+    <w:p>
+      <w:pPr>
+        <w:pStyle w:val="Heading1"/>
+        <w:pBdr>
+          <w:bottom w:val="single" w:color="0C9FD8" w:sz="12" w:space="4"/>
+        </w:pBdr>
+        <w:spacing w:after="200" w:before="360"/>
+      </w:pPr>
+      <w:r>
+        <w:rPr>
+          <w:rFonts w:ascii="Arial" w:cs="Arial" w:eastAsia="Arial" w:hAnsi="Arial"/>
+          <w:b/>
+          <w:bCs/>
+          <w:color w:val="0D1520"/>
+          <w:sz w:val="32"/>
+          <w:szCs w:val="32"/>
+        </w:rPr>
+        <w:t xml:space="preserve">8. Tu zona personal — Flota</w:t>
+      </w:r>
+    </w:p>
+    <w:p>
+      <w:pPr>
+        <w:spacing w:after="120" w:line="300"/>
+      </w:pPr>
+      <w:r>
+        <w:rPr>
+          <w:rFonts w:ascii="Arial" w:cs="Arial" w:eastAsia="Arial" w:hAnsi="Arial"/>
+          <w:color w:val="1A2433"/>
+          <w:sz w:val="22"/>
+          <w:szCs w:val="22"/>
+        </w:rPr>
+        <w:t xml:space="preserve">Pestaña Flota → Pilotos → tu ficha. Solo lectura para ti. Si necesitas actualizar fechas (renovaste licencia, médico), avisa a Luis.</w:t>
+      </w:r>
+    </w:p>
+    <w:p>
+      <w:pPr>
+        <w:pStyle w:val="ListParagraph"/>
+        <w:numPr>
+          <w:ilvl w:val="0"/>
+          <w:numId w:val="2"/>
+        </w:numPr>
+        <w:spacing w:after="80"/>
+      </w:pPr>
+      <w:r>
+        <w:rPr>
+          <w:rFonts w:ascii="Arial" w:cs="Arial" w:eastAsia="Arial" w:hAnsi="Arial"/>
+          <w:color w:val="1A2433"/>
+          <w:sz w:val="22"/>
+          <w:szCs w:val="22"/>
+        </w:rPr>
+        <w:t xml:space="preserve">Licencia (número y vencimiento)</w:t>
+      </w:r>
+    </w:p>
+    <w:p>
+      <w:pPr>
+        <w:pStyle w:val="ListParagraph"/>
+        <w:numPr>
+          <w:ilvl w:val="0"/>
+          <w:numId w:val="2"/>
+        </w:numPr>
+        <w:spacing w:after="80"/>
+      </w:pPr>
+      <w:r>
+        <w:rPr>
+          <w:rFonts w:ascii="Arial" w:cs="Arial" w:eastAsia="Arial" w:hAnsi="Arial"/>
+          <w:color w:val="1A2433"/>
+          <w:sz w:val="22"/>
+          <w:szCs w:val="22"/>
+        </w:rPr>
+        <w:t xml:space="preserve">Certificado médico (vencimiento)</w:t>
+      </w:r>
+    </w:p>
+    <w:p>
+      <w:pPr>
+        <w:pStyle w:val="ListParagraph"/>
+        <w:numPr>
+          <w:ilvl w:val="0"/>
+          <w:numId w:val="2"/>
+        </w:numPr>
+        <w:spacing w:after="80"/>
+      </w:pPr>
+      <w:r>
+        <w:rPr>
+          <w:rFonts w:ascii="Arial" w:cs="Arial" w:eastAsia="Arial" w:hAnsi="Arial"/>
+          <w:color w:val="1A2433"/>
+          <w:sz w:val="22"/>
+          <w:szCs w:val="22"/>
+        </w:rPr>
+        <w:t xml:space="preserve">Habilitaciones (A1/A3, A2, STS, específica)</w:t>
+      </w:r>
+    </w:p>
+    <w:p>
+      <w:pPr>
+        <w:pStyle w:val="ListParagraph"/>
+        <w:numPr>
+          <w:ilvl w:val="0"/>
+          <w:numId w:val="2"/>
+        </w:numPr>
+        <w:spacing w:after="80"/>
+      </w:pPr>
+      <w:r>
+        <w:rPr>
+          <w:rFonts w:ascii="Arial" w:cs="Arial" w:eastAsia="Arial" w:hAnsi="Arial"/>
+          <w:color w:val="1A2433"/>
+          <w:sz w:val="22"/>
+          <w:szCs w:val="22"/>
+        </w:rPr>
+        <w:t xml:space="preserve">Horas de vuelo acumuladas (suma automática de cada A.7)</w:t>
+      </w:r>
+    </w:p>
+    <w:p>
+      <w:pPr>
+        <w:pStyle w:val="Heading1"/>
+        <w:pBdr>
+          <w:bottom w:val="single" w:color="0C9FD8" w:sz="12" w:space="4"/>
+        </w:pBdr>
+        <w:spacing w:after="200" w:before="360"/>
+      </w:pPr>
+      <w:r>
+        <w:rPr>
+          <w:rFonts w:ascii="Arial" w:cs="Arial" w:eastAsia="Arial" w:hAnsi="Arial"/>
+          <w:b/>
+          <w:bCs/>
+          <w:color w:val="0D1520"/>
+          <w:sz w:val="32"/>
+          <w:szCs w:val="32"/>
+        </w:rPr>
+        <w:t xml:space="preserve">9. Atajos y trucos</w:t>
+      </w:r>
+    </w:p>
+    <w:p>
+      <w:pPr>
+        <w:pStyle w:val="ListParagraph"/>
+        <w:numPr>
+          <w:ilvl w:val="0"/>
+          <w:numId w:val="2"/>
+        </w:numPr>
+        <w:spacing w:after="80"/>
+      </w:pPr>
+      <w:r>
+        <w:rPr>
+          <w:rFonts w:ascii="Arial" w:cs="Arial" w:eastAsia="Arial" w:hAnsi="Arial"/>
+          <w:b/>
+          <w:bCs/>
+          <w:color w:val="1A2433"/>
+          <w:sz w:val="22"/>
+          <w:szCs w:val="22"/>
+        </w:rPr>
+        <w:t xml:space="preserve">Mapa: </w:t>
+      </w:r>
+      <w:r>
+        <w:rPr>
+          <w:rFonts w:ascii="Arial" w:cs="Arial" w:eastAsia="Arial" w:hAnsi="Arial"/>
+          <w:color w:val="1A2433"/>
+          <w:sz w:val="22"/>
+          <w:szCs w:val="22"/>
+        </w:rPr>
+        <w:t xml:space="preserve">scroll para zoom, click derecho + arrastrar para girar (3D), botón centrar arriba a la izquierda</w:t>
+      </w:r>
+    </w:p>
+    <w:p>
+      <w:pPr>
+        <w:pStyle w:val="ListParagraph"/>
+        <w:numPr>
+          <w:ilvl w:val="0"/>
+          <w:numId w:val="2"/>
+        </w:numPr>
+        <w:spacing w:after="80"/>
+      </w:pPr>
+      <w:r>
+        <w:rPr>
+          <w:rFonts w:ascii="Arial" w:cs="Arial" w:eastAsia="Arial" w:hAnsi="Arial"/>
+          <w:b/>
+          <w:bCs/>
+          <w:color w:val="1A2433"/>
+          <w:sz w:val="22"/>
+          <w:szCs w:val="22"/>
+        </w:rPr>
+        <w:t xml:space="preserve">NOTAM toggle: </w:t>
+      </w:r>
+      <w:r>
+        <w:rPr>
+          <w:rFonts w:ascii="Arial" w:cs="Arial" w:eastAsia="Arial" w:hAnsi="Arial"/>
+          <w:color w:val="1A2433"/>
+          <w:sz w:val="22"/>
+          <w:szCs w:val="22"/>
+        </w:rPr>
+        <w:t xml:space="preserve">botón NOTAM debajo del centrar mapa — oculta/muestra todos los NOTAMs</w:t>
+      </w:r>
+    </w:p>
+    <w:p>
+      <w:pPr>
+        <w:pStyle w:val="ListParagraph"/>
+        <w:numPr>
+          <w:ilvl w:val="0"/>
+          <w:numId w:val="2"/>
+        </w:numPr>
+        <w:spacing w:after="80"/>
+      </w:pPr>
+      <w:r>
+        <w:rPr>
+          <w:rFonts w:ascii="Arial" w:cs="Arial" w:eastAsia="Arial" w:hAnsi="Arial"/>
+          <w:b/>
+          <w:bCs/>
+          <w:color w:val="1A2433"/>
+          <w:sz w:val="22"/>
+          <w:szCs w:val="22"/>
+        </w:rPr>
+        <w:t xml:space="preserve">Cambio tema: </w:t>
+      </w:r>
+      <w:r>
+        <w:rPr>
+          <w:rFonts w:ascii="Arial" w:cs="Arial" w:eastAsia="Arial" w:hAnsi="Arial"/>
+          <w:color w:val="1A2433"/>
+          <w:sz w:val="22"/>
+          <w:szCs w:val="22"/>
+        </w:rPr>
+        <w:t xml:space="preserve">icono sol/luna en sidebar. Cambia toda la UI Y el mapa</w:t>
+      </w:r>
+    </w:p>
+    <w:p>
+      <w:pPr>
+        <w:pStyle w:val="ListParagraph"/>
+        <w:numPr>
+          <w:ilvl w:val="0"/>
+          <w:numId w:val="2"/>
+        </w:numPr>
+        <w:spacing w:after="80"/>
+      </w:pPr>
+      <w:r>
+        <w:rPr>
+          <w:rFonts w:ascii="Arial" w:cs="Arial" w:eastAsia="Arial" w:hAnsi="Arial"/>
+          <w:b/>
+          <w:bCs/>
+          <w:color w:val="1A2433"/>
+          <w:sz w:val="22"/>
+          <w:szCs w:val="22"/>
+        </w:rPr>
+        <w:t xml:space="preserve">Cambiar contraseña: </w:t>
+      </w:r>
+      <w:r>
+        <w:rPr>
+          <w:rFonts w:ascii="Arial" w:cs="Arial" w:eastAsia="Arial" w:hAnsi="Arial"/>
+          <w:color w:val="1A2433"/>
+          <w:sz w:val="22"/>
+          <w:szCs w:val="22"/>
+        </w:rPr>
+        <w:t xml:space="preserve">icono engranaje en sidebar (al lado del toggle tema)</w:t>
+      </w:r>
+    </w:p>
+    <w:p>
+      <w:pPr>
+        <w:pStyle w:val="ListParagraph"/>
+        <w:numPr>
+          <w:ilvl w:val="0"/>
+          <w:numId w:val="2"/>
+        </w:numPr>
+        <w:spacing w:after="80"/>
+      </w:pPr>
+      <w:r>
+        <w:rPr>
+          <w:rFonts w:ascii="Arial" w:cs="Arial" w:eastAsia="Arial" w:hAnsi="Arial"/>
+          <w:b/>
+          <w:bCs/>
+          <w:color w:val="1A2433"/>
+          <w:sz w:val="22"/>
+          <w:szCs w:val="22"/>
+        </w:rPr>
+        <w:t xml:space="preserve">Tu sesión dura 24h: </w:t>
+      </w:r>
+      <w:r>
+        <w:rPr>
+          <w:rFonts w:ascii="Arial" w:cs="Arial" w:eastAsia="Arial" w:hAnsi="Arial"/>
+          <w:color w:val="1A2433"/>
+          <w:sz w:val="22"/>
+          <w:szCs w:val="22"/>
+        </w:rPr>
+        <w:t xml:space="preserve">se renueva con cada acción</w:t>
+      </w:r>
+    </w:p>
+    <w:p>
+      <w:pPr>
+        <w:pStyle w:val="Heading1"/>
+        <w:pBdr>
+          <w:bottom w:val="single" w:color="0C9FD8" w:sz="12" w:space="4"/>
+        </w:pBdr>
+        <w:spacing w:after="200" w:before="360"/>
+      </w:pPr>
+      <w:r>
+        <w:rPr>
+          <w:rFonts w:ascii="Arial" w:cs="Arial" w:eastAsia="Arial" w:hAnsi="Arial"/>
+          <w:b/>
+          <w:bCs/>
+          <w:color w:val="0D1520"/>
+          <w:sz w:val="32"/>
+          <w:szCs w:val="32"/>
+        </w:rPr>
+        <w:t xml:space="preserve">10. Si algo falla</w:t>
       </w:r>
     </w:p>
     <w:p>
@@ -2523,7 +3113,64 @@
           <w:sz w:val="22"/>
           <w:szCs w:val="22"/>
         </w:rPr>
-        <w:t xml:space="preserve">Referencia al SOR del operador</w:t>
+        <w:t xml:space="preserve">Refrescar (Ctrl+R / Cmd+R) — resuelve 80% de los problemas</w:t>
+      </w:r>
+    </w:p>
+    <w:p>
+      <w:pPr>
+        <w:pStyle w:val="ListParagraph"/>
+        <w:numPr>
+          <w:ilvl w:val="0"/>
+          <w:numId w:val="3"/>
+        </w:numPr>
+        <w:spacing w:after="80"/>
+      </w:pPr>
+      <w:r>
+        <w:rPr>
+          <w:rFonts w:ascii="Arial" w:cs="Arial" w:eastAsia="Arial" w:hAnsi="Arial"/>
+          <w:color w:val="1A2433"/>
+          <w:sz w:val="22"/>
+          <w:szCs w:val="22"/>
+        </w:rPr>
+        <w:t xml:space="preserve">Cerrar sesión y volver a entrar</w:t>
+      </w:r>
+    </w:p>
+    <w:p>
+      <w:pPr>
+        <w:pStyle w:val="ListParagraph"/>
+        <w:numPr>
+          <w:ilvl w:val="0"/>
+          <w:numId w:val="3"/>
+        </w:numPr>
+        <w:spacing w:after="80"/>
+      </w:pPr>
+      <w:r>
+        <w:rPr>
+          <w:rFonts w:ascii="Arial" w:cs="Arial" w:eastAsia="Arial" w:hAnsi="Arial"/>
+          <w:color w:val="1A2433"/>
+          <w:sz w:val="22"/>
+          <w:szCs w:val="22"/>
+        </w:rPr>
+        <w:t xml:space="preserve">Si olvidaste la contraseña → enlace en el login → email reset</w:t>
+      </w:r>
+    </w:p>
+    <w:p>
+      <w:pPr>
+        <w:pStyle w:val="ListParagraph"/>
+        <w:numPr>
+          <w:ilvl w:val="0"/>
+          <w:numId w:val="3"/>
+        </w:numPr>
+        <w:spacing w:after="80"/>
+      </w:pPr>
+      <w:r>
+        <w:rPr>
+          <w:rFonts w:ascii="Arial" w:cs="Arial" w:eastAsia="Arial" w:hAnsi="Arial"/>
+          <w:color w:val="1A2433"/>
+          <w:sz w:val="22"/>
+          <w:szCs w:val="22"/>
+        </w:rPr>
+        <w:t xml:space="preserve">Si persiste: avisa a Luis o JuanCho con captura y código de la misión</w:t>
       </w:r>
     </w:p>
     <w:p>
@@ -2543,1025 +3190,7 @@
           <w:sz w:val="22"/>
           <w:szCs w:val="22"/>
         </w:rPr>
-        <w:t xml:space="preserve">Todos los formularios se firman digitalmente (pad de firma en pantalla, generamos hash + timestamp).</w:t>
-      </w:r>
-    </w:p>
-    <w:p>
-      <w:pPr>
-        <w:pStyle w:val="Heading1"/>
-        <w:pBdr>
-          <w:bottom w:val="single" w:color="0C9FD8" w:sz="12" w:space="4"/>
-        </w:pBdr>
-        <w:spacing w:after="200" w:before="360"/>
-      </w:pPr>
-      <w:r>
-        <w:rPr>
-          <w:rFonts w:ascii="Arial" w:cs="Arial" w:eastAsia="Arial" w:hAnsi="Arial"/>
-          <w:b/>
-          <w:bCs/>
-          <w:color w:val="0D1520"/>
-          <w:sz w:val="32"/>
-          <w:szCs w:val="32"/>
-        </w:rPr>
-        <w:t xml:space="preserve">7. PDF dossier — el entregable AESA</w:t>
-      </w:r>
-    </w:p>
-    <w:p>
-      <w:pPr>
-        <w:spacing w:after="120" w:line="300"/>
-      </w:pPr>
-      <w:r>
-        <w:rPr>
-          <w:rFonts w:ascii="Arial" w:cs="Arial" w:eastAsia="Arial" w:hAnsi="Arial"/>
-          <w:color w:val="1A2433"/>
-          <w:sz w:val="22"/>
-          <w:szCs w:val="22"/>
-        </w:rPr>
-        <w:t xml:space="preserve">Una vez completados los formularios de la misión:</w:t>
-      </w:r>
-    </w:p>
-    <w:p>
-      <w:pPr>
-        <w:spacing w:after="120" w:line="300"/>
-      </w:pPr>
-      <w:r>
-        <w:rPr>
-          <w:rFonts w:ascii="Arial" w:cs="Arial" w:eastAsia="Arial" w:hAnsi="Arial"/>
-          <w:color w:val="1A2433"/>
-          <w:sz w:val="22"/>
-          <w:szCs w:val="22"/>
-        </w:rPr>
-        <w:t xml:space="preserve">Compliance → botón Generar dossier PDF</w:t>
-      </w:r>
-    </w:p>
-    <w:p>
-      <w:pPr>
-        <w:pStyle w:val="Heading3"/>
-        <w:spacing w:after="100" w:before="200"/>
-      </w:pPr>
-      <w:r>
-        <w:rPr>
-          <w:rFonts w:ascii="Arial" w:cs="Arial" w:eastAsia="Arial" w:hAnsi="Arial"/>
-          <w:b/>
-          <w:bCs/>
-          <w:color w:val="0D1520"/>
-          <w:sz w:val="22"/>
-          <w:szCs w:val="22"/>
-        </w:rPr>
-        <w:t xml:space="preserve">Sale un PDF único con:</w:t>
-      </w:r>
-    </w:p>
-    <w:p>
-      <w:pPr>
-        <w:pStyle w:val="ListParagraph"/>
-        <w:numPr>
-          <w:ilvl w:val="0"/>
-          <w:numId w:val="3"/>
-        </w:numPr>
-        <w:spacing w:after="80"/>
-      </w:pPr>
-      <w:r>
-        <w:rPr>
-          <w:rFonts w:ascii="Arial" w:cs="Arial" w:eastAsia="Arial" w:hAnsi="Arial"/>
-          <w:color w:val="1A2433"/>
-          <w:sz w:val="22"/>
-          <w:szCs w:val="22"/>
-        </w:rPr>
-        <w:t xml:space="preserve">Portada con datos del operador (Skypro360)</w:t>
-      </w:r>
-    </w:p>
-    <w:p>
-      <w:pPr>
-        <w:pStyle w:val="ListParagraph"/>
-        <w:numPr>
-          <w:ilvl w:val="0"/>
-          <w:numId w:val="3"/>
-        </w:numPr>
-        <w:spacing w:after="80"/>
-      </w:pPr>
-      <w:r>
-        <w:rPr>
-          <w:rFonts w:ascii="Arial" w:cs="Arial" w:eastAsia="Arial" w:hAnsi="Arial"/>
-          <w:color w:val="1A2433"/>
-          <w:sz w:val="22"/>
-          <w:szCs w:val="22"/>
-        </w:rPr>
-        <w:t xml:space="preserve">Datos de la misión (código, fechas, ubicación)</w:t>
-      </w:r>
-    </w:p>
-    <w:p>
-      <w:pPr>
-        <w:pStyle w:val="ListParagraph"/>
-        <w:numPr>
-          <w:ilvl w:val="0"/>
-          <w:numId w:val="3"/>
-        </w:numPr>
-        <w:spacing w:after="80"/>
-      </w:pPr>
-      <w:r>
-        <w:rPr>
-          <w:rFonts w:ascii="Arial" w:cs="Arial" w:eastAsia="Arial" w:hAnsi="Arial"/>
-          <w:color w:val="1A2433"/>
-          <w:sz w:val="22"/>
-          <w:szCs w:val="22"/>
-        </w:rPr>
-        <w:t xml:space="preserve">A.4 + firma piloto</w:t>
-      </w:r>
-    </w:p>
-    <w:p>
-      <w:pPr>
-        <w:pStyle w:val="ListParagraph"/>
-        <w:numPr>
-          <w:ilvl w:val="0"/>
-          <w:numId w:val="3"/>
-        </w:numPr>
-        <w:spacing w:after="80"/>
-      </w:pPr>
-      <w:r>
-        <w:rPr>
-          <w:rFonts w:ascii="Arial" w:cs="Arial" w:eastAsia="Arial" w:hAnsi="Arial"/>
-          <w:color w:val="1A2433"/>
-          <w:sz w:val="22"/>
-          <w:szCs w:val="22"/>
-        </w:rPr>
-        <w:t xml:space="preserve">A.5 + firma piloto</w:t>
-      </w:r>
-    </w:p>
-    <w:p>
-      <w:pPr>
-        <w:pStyle w:val="ListParagraph"/>
-        <w:numPr>
-          <w:ilvl w:val="0"/>
-          <w:numId w:val="3"/>
-        </w:numPr>
-        <w:spacing w:after="80"/>
-      </w:pPr>
-      <w:r>
-        <w:rPr>
-          <w:rFonts w:ascii="Arial" w:cs="Arial" w:eastAsia="Arial" w:hAnsi="Arial"/>
-          <w:color w:val="1A2433"/>
-          <w:sz w:val="22"/>
-          <w:szCs w:val="22"/>
-        </w:rPr>
-        <w:t xml:space="preserve">A.6 (si aplica)</w:t>
-      </w:r>
-    </w:p>
-    <w:p>
-      <w:pPr>
-        <w:pStyle w:val="ListParagraph"/>
-        <w:numPr>
-          <w:ilvl w:val="0"/>
-          <w:numId w:val="3"/>
-        </w:numPr>
-        <w:spacing w:after="80"/>
-      </w:pPr>
-      <w:r>
-        <w:rPr>
-          <w:rFonts w:ascii="Arial" w:cs="Arial" w:eastAsia="Arial" w:hAnsi="Arial"/>
-          <w:color w:val="1A2433"/>
-          <w:sz w:val="22"/>
-          <w:szCs w:val="22"/>
-        </w:rPr>
-        <w:t xml:space="preserve">A.7 + horas voladas calculadas</w:t>
-      </w:r>
-    </w:p>
-    <w:p>
-      <w:pPr>
-        <w:pStyle w:val="ListParagraph"/>
-        <w:numPr>
-          <w:ilvl w:val="0"/>
-          <w:numId w:val="3"/>
-        </w:numPr>
-        <w:spacing w:after="80"/>
-      </w:pPr>
-      <w:r>
-        <w:rPr>
-          <w:rFonts w:ascii="Arial" w:cs="Arial" w:eastAsia="Arial" w:hAnsi="Arial"/>
-          <w:color w:val="1A2433"/>
-          <w:sz w:val="22"/>
-          <w:szCs w:val="22"/>
-        </w:rPr>
-        <w:t xml:space="preserve">A.8 (si aplica)</w:t>
-      </w:r>
-    </w:p>
-    <w:p>
-      <w:pPr>
-        <w:pStyle w:val="ListParagraph"/>
-        <w:numPr>
-          <w:ilvl w:val="0"/>
-          <w:numId w:val="3"/>
-        </w:numPr>
-        <w:spacing w:after="80"/>
-      </w:pPr>
-      <w:r>
-        <w:rPr>
-          <w:rFonts w:ascii="Arial" w:cs="Arial" w:eastAsia="Arial" w:hAnsi="Arial"/>
-          <w:color w:val="1A2433"/>
-          <w:sz w:val="22"/>
-          <w:szCs w:val="22"/>
-        </w:rPr>
-        <w:t xml:space="preserve">Anexos</w:t>
-      </w:r>
-    </w:p>
-    <w:p>
-      <w:pPr>
-        <w:pBdr>
-          <w:left w:val="single" w:color="F04E1C" w:sz="18" w:space="12"/>
-        </w:pBdr>
-        <w:spacing w:after="120" w:before="120"/>
-        <w:ind w:left="360"/>
-      </w:pPr>
-      <w:r>
-        <w:rPr>
-          <w:rFonts w:ascii="Arial" w:cs="Arial" w:eastAsia="Arial" w:hAnsi="Arial"/>
-          <w:i/>
-          <w:iCs/>
-          <w:color w:val="5A7A9A"/>
-          <w:sz w:val="22"/>
-          <w:szCs w:val="22"/>
-        </w:rPr>
-        <w:t xml:space="preserve">Este PDF es el que se entrega a AESA en caso de auditoría o inspección. Guárdalo en tu sistema documental.</w:t>
-      </w:r>
-    </w:p>
-    <w:p>
-      <w:pPr>
-        <w:pStyle w:val="Heading1"/>
-        <w:pBdr>
-          <w:bottom w:val="single" w:color="0C9FD8" w:sz="12" w:space="4"/>
-        </w:pBdr>
-        <w:spacing w:after="200" w:before="360"/>
-      </w:pPr>
-      <w:r>
-        <w:rPr>
-          <w:rFonts w:ascii="Arial" w:cs="Arial" w:eastAsia="Arial" w:hAnsi="Arial"/>
-          <w:b/>
-          <w:bCs/>
-          <w:color w:val="0D1520"/>
-          <w:sz w:val="32"/>
-          <w:szCs w:val="32"/>
-        </w:rPr>
-        <w:t xml:space="preserve">8. Tu zona personal — Flota</w:t>
-      </w:r>
-    </w:p>
-    <w:p>
-      <w:pPr>
-        <w:spacing w:after="120" w:line="300"/>
-      </w:pPr>
-      <w:r>
-        <w:rPr>
-          <w:rFonts w:ascii="Arial" w:cs="Arial" w:eastAsia="Arial" w:hAnsi="Arial"/>
-          <w:color w:val="1A2433"/>
-          <w:sz w:val="22"/>
-          <w:szCs w:val="22"/>
-        </w:rPr>
-        <w:t xml:space="preserve">Pestaña Flota → Pilotos → tu ficha. Verás:</w:t>
-      </w:r>
-    </w:p>
-    <w:p>
-      <w:pPr>
-        <w:pStyle w:val="ListParagraph"/>
-        <w:numPr>
-          <w:ilvl w:val="0"/>
-          <w:numId w:val="3"/>
-        </w:numPr>
-        <w:spacing w:after="80"/>
-      </w:pPr>
-      <w:r>
-        <w:rPr>
-          <w:rFonts w:ascii="Arial" w:cs="Arial" w:eastAsia="Arial" w:hAnsi="Arial"/>
-          <w:color w:val="1A2433"/>
-          <w:sz w:val="22"/>
-          <w:szCs w:val="22"/>
-        </w:rPr>
-        <w:t xml:space="preserve">Licencia (número y vencimiento)</w:t>
-      </w:r>
-    </w:p>
-    <w:p>
-      <w:pPr>
-        <w:pStyle w:val="ListParagraph"/>
-        <w:numPr>
-          <w:ilvl w:val="0"/>
-          <w:numId w:val="3"/>
-        </w:numPr>
-        <w:spacing w:after="80"/>
-      </w:pPr>
-      <w:r>
-        <w:rPr>
-          <w:rFonts w:ascii="Arial" w:cs="Arial" w:eastAsia="Arial" w:hAnsi="Arial"/>
-          <w:color w:val="1A2433"/>
-          <w:sz w:val="22"/>
-          <w:szCs w:val="22"/>
-        </w:rPr>
-        <w:t xml:space="preserve">Certificado médico (vencimiento)</w:t>
-      </w:r>
-    </w:p>
-    <w:p>
-      <w:pPr>
-        <w:pStyle w:val="ListParagraph"/>
-        <w:numPr>
-          <w:ilvl w:val="0"/>
-          <w:numId w:val="3"/>
-        </w:numPr>
-        <w:spacing w:after="80"/>
-      </w:pPr>
-      <w:r>
-        <w:rPr>
-          <w:rFonts w:ascii="Arial" w:cs="Arial" w:eastAsia="Arial" w:hAnsi="Arial"/>
-          <w:color w:val="1A2433"/>
-          <w:sz w:val="22"/>
-          <w:szCs w:val="22"/>
-        </w:rPr>
-        <w:t xml:space="preserve">Habilitaciones (A1/A3, A2, STS, específica)</w:t>
-      </w:r>
-    </w:p>
-    <w:p>
-      <w:pPr>
-        <w:pStyle w:val="ListParagraph"/>
-        <w:numPr>
-          <w:ilvl w:val="0"/>
-          <w:numId w:val="3"/>
-        </w:numPr>
-        <w:spacing w:after="80"/>
-      </w:pPr>
-      <w:r>
-        <w:rPr>
-          <w:rFonts w:ascii="Arial" w:cs="Arial" w:eastAsia="Arial" w:hAnsi="Arial"/>
-          <w:color w:val="1A2433"/>
-          <w:sz w:val="22"/>
-          <w:szCs w:val="22"/>
-        </w:rPr>
-        <w:t xml:space="preserve">Horas de vuelo acumuladas (suma automática de cada A.7)</w:t>
-      </w:r>
-    </w:p>
-    <w:p>
-      <w:pPr>
-        <w:pBdr>
-          <w:left w:val="single" w:color="F04E1C" w:sz="18" w:space="12"/>
-        </w:pBdr>
-        <w:spacing w:after="120" w:before="120"/>
-        <w:ind w:left="360"/>
-      </w:pPr>
-      <w:r>
-        <w:rPr>
-          <w:rFonts w:ascii="Arial" w:cs="Arial" w:eastAsia="Arial" w:hAnsi="Arial"/>
-          <w:i/>
-          <w:iCs/>
-          <w:color w:val="5A7A9A"/>
-          <w:sz w:val="22"/>
-          <w:szCs w:val="22"/>
-        </w:rPr>
-        <w:t xml:space="preserve">Si algún documento está a &lt; 30 días de caducar, aparece en alertas del cockpit. Hablar con Luis (admin) para renovar fechas en plataforma cuando los actualices.</w:t>
-      </w:r>
-    </w:p>
-    <w:p>
-      <w:pPr>
-        <w:pStyle w:val="Heading1"/>
-        <w:pBdr>
-          <w:bottom w:val="single" w:color="0C9FD8" w:sz="12" w:space="4"/>
-        </w:pBdr>
-        <w:spacing w:after="200" w:before="360"/>
-      </w:pPr>
-      <w:r>
-        <w:rPr>
-          <w:rFonts w:ascii="Arial" w:cs="Arial" w:eastAsia="Arial" w:hAnsi="Arial"/>
-          <w:b/>
-          <w:bCs/>
-          <w:color w:val="0D1520"/>
-          <w:sz w:val="32"/>
-          <w:szCs w:val="32"/>
-        </w:rPr>
-        <w:t xml:space="preserve">9. Flujo completo — caso real</w:t>
-      </w:r>
-    </w:p>
-    <w:p>
-      <w:pPr>
-        <w:pBdr>
-          <w:left w:val="single" w:color="F04E1C" w:sz="18" w:space="12"/>
-        </w:pBdr>
-        <w:spacing w:after="120" w:before="120"/>
-        <w:ind w:left="360"/>
-      </w:pPr>
-      <w:r>
-        <w:rPr>
-          <w:rFonts w:ascii="Arial" w:cs="Arial" w:eastAsia="Arial" w:hAnsi="Arial"/>
-          <w:i/>
-          <w:iCs/>
-          <w:color w:val="5A7A9A"/>
-          <w:sz w:val="22"/>
-          <w:szCs w:val="22"/>
-        </w:rPr>
-        <w:t xml:space="preserve">Misión: inspección torre eléctrica en Herrera del Duque, 4 de mayo 11:00.</w:t>
-      </w:r>
-    </w:p>
-    <w:p>
-      <w:pPr>
-        <w:pStyle w:val="ListParagraph"/>
-        <w:numPr>
-          <w:ilvl w:val="0"/>
-          <w:numId w:val="2"/>
-        </w:numPr>
-        <w:spacing w:after="80"/>
-      </w:pPr>
-      <w:r>
-        <w:rPr>
-          <w:rFonts w:ascii="Arial" w:cs="Arial" w:eastAsia="Arial" w:hAnsi="Arial"/>
-          <w:color w:val="1A2433"/>
-          <w:sz w:val="22"/>
-          <w:szCs w:val="22"/>
-        </w:rPr>
-        <w:t xml:space="preserve">Día anterior — entras al cockpit → revisas alertas vencimiento (todo OK) → revisas BOE (sin novedades regulatorias)</w:t>
-      </w:r>
-    </w:p>
-    <w:p>
-      <w:pPr>
-        <w:pStyle w:val="ListParagraph"/>
-        <w:numPr>
-          <w:ilvl w:val="0"/>
-          <w:numId w:val="2"/>
-        </w:numPr>
-        <w:spacing w:after="80"/>
-      </w:pPr>
-      <w:r>
-        <w:rPr>
-          <w:rFonts w:ascii="Arial" w:cs="Arial" w:eastAsia="Arial" w:hAnsi="Arial"/>
-          <w:color w:val="1A2433"/>
-          <w:sz w:val="22"/>
-          <w:szCs w:val="22"/>
-        </w:rPr>
-        <w:t xml:space="preserve">Espacio OPS → centras Herrera del Duque → confirmas que no hay NOTAM activo en la zona → verificas meteo (vientos &lt; 25 km/h, sin precipitación → apto vuelo)</w:t>
-      </w:r>
-    </w:p>
-    <w:p>
-      <w:pPr>
-        <w:pStyle w:val="ListParagraph"/>
-        <w:numPr>
-          <w:ilvl w:val="0"/>
-          <w:numId w:val="2"/>
-        </w:numPr>
-        <w:spacing w:after="80"/>
-      </w:pPr>
-      <w:r>
-        <w:rPr>
-          <w:rFonts w:ascii="Arial" w:cs="Arial" w:eastAsia="Arial" w:hAnsi="Arial"/>
-          <w:color w:val="1A2433"/>
-          <w:sz w:val="22"/>
-          <w:szCs w:val="22"/>
-        </w:rPr>
-        <w:t xml:space="preserve">Misiones → Nueva → rellenas datos → guardar (estado draft)</w:t>
-      </w:r>
-    </w:p>
-    <w:p>
-      <w:pPr>
-        <w:pStyle w:val="ListParagraph"/>
-        <w:numPr>
-          <w:ilvl w:val="0"/>
-          <w:numId w:val="2"/>
-        </w:numPr>
-        <w:spacing w:after="80"/>
-      </w:pPr>
-      <w:r>
-        <w:rPr>
-          <w:rFonts w:ascii="Arial" w:cs="Arial" w:eastAsia="Arial" w:hAnsi="Arial"/>
-          <w:color w:val="1A2433"/>
-          <w:sz w:val="22"/>
-          <w:szCs w:val="22"/>
-        </w:rPr>
-        <w:t xml:space="preserve">Editas la misión → planned → approved</w:t>
-      </w:r>
-    </w:p>
-    <w:p>
-      <w:pPr>
-        <w:pStyle w:val="ListParagraph"/>
-        <w:numPr>
-          <w:ilvl w:val="0"/>
-          <w:numId w:val="2"/>
-        </w:numPr>
-        <w:spacing w:after="80"/>
-      </w:pPr>
-      <w:r>
-        <w:rPr>
-          <w:rFonts w:ascii="Arial" w:cs="Arial" w:eastAsia="Arial" w:hAnsi="Arial"/>
-          <w:color w:val="1A2433"/>
-          <w:sz w:val="22"/>
-          <w:szCs w:val="22"/>
-        </w:rPr>
-        <w:t xml:space="preserve">Compliance → A.4 → rellenas planificación → firmas → estado pasa a preflight</w:t>
-      </w:r>
-    </w:p>
-    <w:p>
-      <w:pPr>
-        <w:pStyle w:val="ListParagraph"/>
-        <w:numPr>
-          <w:ilvl w:val="0"/>
-          <w:numId w:val="2"/>
-        </w:numPr>
-        <w:spacing w:after="80"/>
-      </w:pPr>
-      <w:r>
-        <w:rPr>
-          <w:rFonts w:ascii="Arial" w:cs="Arial" w:eastAsia="Arial" w:hAnsi="Arial"/>
-          <w:color w:val="1A2433"/>
-          <w:sz w:val="22"/>
-          <w:szCs w:val="22"/>
-        </w:rPr>
-        <w:t xml:space="preserve">En el lugar de vuelo → A.5 pre-flight checklist → firmas</w:t>
-      </w:r>
-    </w:p>
-    <w:p>
-      <w:pPr>
-        <w:pStyle w:val="ListParagraph"/>
-        <w:numPr>
-          <w:ilvl w:val="0"/>
-          <w:numId w:val="2"/>
-        </w:numPr>
-        <w:spacing w:after="80"/>
-      </w:pPr>
-      <w:r>
-        <w:rPr>
-          <w:rFonts w:ascii="Arial" w:cs="Arial" w:eastAsia="Arial" w:hAnsi="Arial"/>
-          <w:color w:val="1A2433"/>
-          <w:sz w:val="22"/>
-          <w:szCs w:val="22"/>
-        </w:rPr>
-        <w:t xml:space="preserve">Cambias estado a in_flight → vuela</w:t>
-      </w:r>
-    </w:p>
-    <w:p>
-      <w:pPr>
-        <w:pStyle w:val="ListParagraph"/>
-        <w:numPr>
-          <w:ilvl w:val="0"/>
-          <w:numId w:val="2"/>
-        </w:numPr>
-        <w:spacing w:after="80"/>
-      </w:pPr>
-      <w:r>
-        <w:rPr>
-          <w:rFonts w:ascii="Arial" w:cs="Arial" w:eastAsia="Arial" w:hAnsi="Arial"/>
-          <w:color w:val="1A2433"/>
-          <w:sz w:val="22"/>
-          <w:szCs w:val="22"/>
-        </w:rPr>
-        <w:t xml:space="preserve">Aterrizas → A.7 post-flight → horas voladas → firmas → estado completed</w:t>
-      </w:r>
-    </w:p>
-    <w:p>
-      <w:pPr>
-        <w:pStyle w:val="ListParagraph"/>
-        <w:numPr>
-          <w:ilvl w:val="0"/>
-          <w:numId w:val="2"/>
-        </w:numPr>
-        <w:spacing w:after="80"/>
-      </w:pPr>
-      <w:r>
-        <w:rPr>
-          <w:rFonts w:ascii="Arial" w:cs="Arial" w:eastAsia="Arial" w:hAnsi="Arial"/>
-          <w:color w:val="1A2433"/>
-          <w:sz w:val="22"/>
-          <w:szCs w:val="22"/>
-        </w:rPr>
-        <w:t xml:space="preserve">Generar dossier PDF → archivar</w:t>
-      </w:r>
-    </w:p>
-    <w:p>
-      <w:pPr>
-        <w:pStyle w:val="Heading1"/>
-        <w:pBdr>
-          <w:bottom w:val="single" w:color="0C9FD8" w:sz="12" w:space="4"/>
-        </w:pBdr>
-        <w:spacing w:after="200" w:before="360"/>
-      </w:pPr>
-      <w:r>
-        <w:rPr>
-          <w:rFonts w:ascii="Arial" w:cs="Arial" w:eastAsia="Arial" w:hAnsi="Arial"/>
-          <w:b/>
-          <w:bCs/>
-          <w:color w:val="0D1520"/>
-          <w:sz w:val="32"/>
-          <w:szCs w:val="32"/>
-        </w:rPr>
-        <w:t xml:space="preserve">10. Para tu rol de formador (cuando lo asumas)</w:t>
-      </w:r>
-    </w:p>
-    <w:p>
-      <w:pPr>
-        <w:spacing w:after="120" w:line="300"/>
-      </w:pPr>
-      <w:r>
-        <w:rPr>
-          <w:rFonts w:ascii="Arial" w:cs="Arial" w:eastAsia="Arial" w:hAnsi="Arial"/>
-          <w:color w:val="1A2433"/>
-          <w:sz w:val="22"/>
-          <w:szCs w:val="22"/>
-        </w:rPr>
-        <w:t xml:space="preserve">Cuando entrenes a pilotos junior, los puntos clave a enseñar:</w:t>
-      </w:r>
-    </w:p>
-    <w:p>
-      <w:pPr>
-        <w:pStyle w:val="ListParagraph"/>
-        <w:numPr>
-          <w:ilvl w:val="0"/>
-          <w:numId w:val="2"/>
-        </w:numPr>
-        <w:spacing w:after="80"/>
-      </w:pPr>
-      <w:r>
-        <w:rPr>
-          <w:rFonts w:ascii="Arial" w:cs="Arial" w:eastAsia="Arial" w:hAnsi="Arial"/>
-          <w:color w:val="1A2433"/>
-          <w:sz w:val="22"/>
-          <w:szCs w:val="22"/>
-        </w:rPr>
-        <w:t xml:space="preserve">Disciplina del estado: nunca saltarse formularios. Si saltas un A.4, no puedes pasar a in_flight.</w:t>
-      </w:r>
-    </w:p>
-    <w:p>
-      <w:pPr>
-        <w:pStyle w:val="ListParagraph"/>
-        <w:numPr>
-          <w:ilvl w:val="0"/>
-          <w:numId w:val="2"/>
-        </w:numPr>
-        <w:spacing w:after="80"/>
-      </w:pPr>
-      <w:r>
-        <w:rPr>
-          <w:rFonts w:ascii="Arial" w:cs="Arial" w:eastAsia="Arial" w:hAnsi="Arial"/>
-          <w:color w:val="1A2433"/>
-          <w:sz w:val="22"/>
-          <w:szCs w:val="22"/>
-        </w:rPr>
-        <w:t xml:space="preserve">NOTAM check siempre: el Espacio OPS es la primera parada antes de cualquier vuelo.</w:t>
-      </w:r>
-    </w:p>
-    <w:p>
-      <w:pPr>
-        <w:pStyle w:val="ListParagraph"/>
-        <w:numPr>
-          <w:ilvl w:val="0"/>
-          <w:numId w:val="2"/>
-        </w:numPr>
-        <w:spacing w:after="80"/>
-      </w:pPr>
-      <w:r>
-        <w:rPr>
-          <w:rFonts w:ascii="Arial" w:cs="Arial" w:eastAsia="Arial" w:hAnsi="Arial"/>
-          <w:color w:val="1A2433"/>
-          <w:sz w:val="22"/>
-          <w:szCs w:val="22"/>
-        </w:rPr>
-        <w:t xml:space="preserve">Meteo: el badge "apto vuelo" es indicativo, no autoritativo. Última palabra siempre del piloto.</w:t>
-      </w:r>
-    </w:p>
-    <w:p>
-      <w:pPr>
-        <w:pStyle w:val="ListParagraph"/>
-        <w:numPr>
-          <w:ilvl w:val="0"/>
-          <w:numId w:val="2"/>
-        </w:numPr>
-        <w:spacing w:after="80"/>
-      </w:pPr>
-      <w:r>
-        <w:rPr>
-          <w:rFonts w:ascii="Arial" w:cs="Arial" w:eastAsia="Arial" w:hAnsi="Arial"/>
-          <w:color w:val="1A2433"/>
-          <w:sz w:val="22"/>
-          <w:szCs w:val="22"/>
-        </w:rPr>
-        <w:t xml:space="preserve">Firmas digitales: tienen valor legal. No firmar si no estás conforme.</w:t>
-      </w:r>
-    </w:p>
-    <w:p>
-      <w:pPr>
-        <w:pStyle w:val="ListParagraph"/>
-        <w:numPr>
-          <w:ilvl w:val="0"/>
-          <w:numId w:val="2"/>
-        </w:numPr>
-        <w:spacing w:after="80"/>
-      </w:pPr>
-      <w:r>
-        <w:rPr>
-          <w:rFonts w:ascii="Arial" w:cs="Arial" w:eastAsia="Arial" w:hAnsi="Arial"/>
-          <w:color w:val="1A2433"/>
-          <w:sz w:val="22"/>
-          <w:szCs w:val="22"/>
-        </w:rPr>
-        <w:t xml:space="preserve">PDF dossier: el operador entrega esto a AESA — la calidad del vuelo se mide por la calidad del dossier.</w:t>
-      </w:r>
-    </w:p>
-    <w:p>
-      <w:pPr>
-        <w:pStyle w:val="Heading3"/>
-        <w:spacing w:after="100" w:before="200"/>
-      </w:pPr>
-      <w:r>
-        <w:rPr>
-          <w:rFonts w:ascii="Arial" w:cs="Arial" w:eastAsia="Arial" w:hAnsi="Arial"/>
-          <w:b/>
-          <w:bCs/>
-          <w:color w:val="0D1520"/>
-          <w:sz w:val="22"/>
-          <w:szCs w:val="22"/>
-        </w:rPr>
-        <w:t xml:space="preserve">Para sesiones de formación recomiendo:</w:t>
-      </w:r>
-    </w:p>
-    <w:p>
-      <w:pPr>
-        <w:pStyle w:val="ListParagraph"/>
-        <w:numPr>
-          <w:ilvl w:val="0"/>
-          <w:numId w:val="3"/>
-        </w:numPr>
-        <w:spacing w:after="80"/>
-      </w:pPr>
-      <w:r>
-        <w:rPr>
-          <w:rFonts w:ascii="Arial" w:cs="Arial" w:eastAsia="Arial" w:hAnsi="Arial"/>
-          <w:color w:val="1A2433"/>
-          <w:sz w:val="22"/>
-          <w:szCs w:val="22"/>
-        </w:rPr>
-        <w:t xml:space="preserve">Crear un tenant demo / sandbox para que practiquen sin afectar datos reales</w:t>
-      </w:r>
-    </w:p>
-    <w:p>
-      <w:pPr>
-        <w:pStyle w:val="ListParagraph"/>
-        <w:numPr>
-          <w:ilvl w:val="0"/>
-          <w:numId w:val="3"/>
-        </w:numPr>
-        <w:spacing w:after="80"/>
-      </w:pPr>
-      <w:r>
-        <w:rPr>
-          <w:rFonts w:ascii="Arial" w:cs="Arial" w:eastAsia="Arial" w:hAnsi="Arial"/>
-          <w:color w:val="1A2433"/>
-          <w:sz w:val="22"/>
-          <w:szCs w:val="22"/>
-        </w:rPr>
-        <w:t xml:space="preserve">Crear misiones ficticias en estado draft para que recorran el ciclo completo</w:t>
-      </w:r>
-    </w:p>
-    <w:p>
-      <w:pPr>
-        <w:pStyle w:val="ListParagraph"/>
-        <w:numPr>
-          <w:ilvl w:val="0"/>
-          <w:numId w:val="3"/>
-        </w:numPr>
-        <w:spacing w:after="80"/>
-      </w:pPr>
-      <w:r>
-        <w:rPr>
-          <w:rFonts w:ascii="Arial" w:cs="Arial" w:eastAsia="Arial" w:hAnsi="Arial"/>
-          <w:color w:val="1A2433"/>
-          <w:sz w:val="22"/>
-          <w:szCs w:val="22"/>
-        </w:rPr>
-        <w:t xml:space="preserve">Repasar dossiers PDF reales (anonimizados) para entender qué se evalúa</w:t>
-      </w:r>
-    </w:p>
-    <w:p>
-      <w:pPr>
-        <w:pStyle w:val="Heading1"/>
-        <w:pBdr>
-          <w:bottom w:val="single" w:color="0C9FD8" w:sz="12" w:space="4"/>
-        </w:pBdr>
-        <w:spacing w:after="200" w:before="360"/>
-      </w:pPr>
-      <w:r>
-        <w:rPr>
-          <w:rFonts w:ascii="Arial" w:cs="Arial" w:eastAsia="Arial" w:hAnsi="Arial"/>
-          <w:b/>
-          <w:bCs/>
-          <w:color w:val="0D1520"/>
-          <w:sz w:val="32"/>
-          <w:szCs w:val="32"/>
-        </w:rPr>
-        <w:t xml:space="preserve">11. Atajos y trucos</w:t>
-      </w:r>
-    </w:p>
-    <w:p>
-      <w:pPr>
-        <w:pStyle w:val="ListParagraph"/>
-        <w:numPr>
-          <w:ilvl w:val="0"/>
-          <w:numId w:val="3"/>
-        </w:numPr>
-        <w:spacing w:after="80"/>
-      </w:pPr>
-      <w:r>
-        <w:rPr>
-          <w:rFonts w:ascii="Arial" w:cs="Arial" w:eastAsia="Arial" w:hAnsi="Arial"/>
-          <w:b/>
-          <w:bCs/>
-          <w:color w:val="1A2433"/>
-          <w:sz w:val="22"/>
-          <w:szCs w:val="22"/>
-        </w:rPr>
-        <w:t xml:space="preserve">Mapa: </w:t>
-      </w:r>
-      <w:r>
-        <w:rPr>
-          <w:rFonts w:ascii="Arial" w:cs="Arial" w:eastAsia="Arial" w:hAnsi="Arial"/>
-          <w:color w:val="1A2433"/>
-          <w:sz w:val="22"/>
-          <w:szCs w:val="22"/>
-        </w:rPr>
-        <w:t xml:space="preserve">scroll para zoom, click derecho + arrastrar para girar (3D), botón centrar arriba a la izquierda</w:t>
-      </w:r>
-    </w:p>
-    <w:p>
-      <w:pPr>
-        <w:pStyle w:val="ListParagraph"/>
-        <w:numPr>
-          <w:ilvl w:val="0"/>
-          <w:numId w:val="3"/>
-        </w:numPr>
-        <w:spacing w:after="80"/>
-      </w:pPr>
-      <w:r>
-        <w:rPr>
-          <w:rFonts w:ascii="Arial" w:cs="Arial" w:eastAsia="Arial" w:hAnsi="Arial"/>
-          <w:b/>
-          <w:bCs/>
-          <w:color w:val="1A2433"/>
-          <w:sz w:val="22"/>
-          <w:szCs w:val="22"/>
-        </w:rPr>
-        <w:t xml:space="preserve">NOTAM toggle: </w:t>
-      </w:r>
-      <w:r>
-        <w:rPr>
-          <w:rFonts w:ascii="Arial" w:cs="Arial" w:eastAsia="Arial" w:hAnsi="Arial"/>
-          <w:color w:val="1A2433"/>
-          <w:sz w:val="22"/>
-          <w:szCs w:val="22"/>
-        </w:rPr>
-        <w:t xml:space="preserve">botón NOTAM debajo del centrar mapa — oculta/muestra todos los NOTAMs</w:t>
-      </w:r>
-    </w:p>
-    <w:p>
-      <w:pPr>
-        <w:pStyle w:val="ListParagraph"/>
-        <w:numPr>
-          <w:ilvl w:val="0"/>
-          <w:numId w:val="3"/>
-        </w:numPr>
-        <w:spacing w:after="80"/>
-      </w:pPr>
-      <w:r>
-        <w:rPr>
-          <w:rFonts w:ascii="Arial" w:cs="Arial" w:eastAsia="Arial" w:hAnsi="Arial"/>
-          <w:b/>
-          <w:bCs/>
-          <w:color w:val="1A2433"/>
-          <w:sz w:val="22"/>
-          <w:szCs w:val="22"/>
-        </w:rPr>
-        <w:t xml:space="preserve">Modo claro de día / oscuro de noche: </w:t>
-      </w:r>
-      <w:r>
-        <w:rPr>
-          <w:rFonts w:ascii="Arial" w:cs="Arial" w:eastAsia="Arial" w:hAnsi="Arial"/>
-          <w:color w:val="1A2433"/>
-          <w:sz w:val="22"/>
-          <w:szCs w:val="22"/>
-        </w:rPr>
-        <w:t xml:space="preserve">el toggle está en el sidebar</w:t>
-      </w:r>
-    </w:p>
-    <w:p>
-      <w:pPr>
-        <w:pStyle w:val="ListParagraph"/>
-        <w:numPr>
-          <w:ilvl w:val="0"/>
-          <w:numId w:val="3"/>
-        </w:numPr>
-        <w:spacing w:after="80"/>
-      </w:pPr>
-      <w:r>
-        <w:rPr>
-          <w:rFonts w:ascii="Arial" w:cs="Arial" w:eastAsia="Arial" w:hAnsi="Arial"/>
-          <w:b/>
-          <w:bCs/>
-          <w:color w:val="1A2433"/>
-          <w:sz w:val="22"/>
-          <w:szCs w:val="22"/>
-        </w:rPr>
-        <w:t xml:space="preserve">Tu sesión dura 24h: </w:t>
-      </w:r>
-      <w:r>
-        <w:rPr>
-          <w:rFonts w:ascii="Arial" w:cs="Arial" w:eastAsia="Arial" w:hAnsi="Arial"/>
-          <w:color w:val="1A2433"/>
-          <w:sz w:val="22"/>
-          <w:szCs w:val="22"/>
-        </w:rPr>
-        <w:t xml:space="preserve">se renueva automáticamente con cada acción</w:t>
-      </w:r>
-    </w:p>
-    <w:p>
-      <w:pPr>
-        <w:pStyle w:val="Heading1"/>
-        <w:pBdr>
-          <w:bottom w:val="single" w:color="0C9FD8" w:sz="12" w:space="4"/>
-        </w:pBdr>
-        <w:spacing w:after="200" w:before="360"/>
-      </w:pPr>
-      <w:r>
-        <w:rPr>
-          <w:rFonts w:ascii="Arial" w:cs="Arial" w:eastAsia="Arial" w:hAnsi="Arial"/>
-          <w:b/>
-          <w:bCs/>
-          <w:color w:val="0D1520"/>
-          <w:sz w:val="32"/>
-          <w:szCs w:val="32"/>
-        </w:rPr>
-        <w:t xml:space="preserve">12. Si algo falla</w:t>
-      </w:r>
-    </w:p>
-    <w:p>
-      <w:pPr>
-        <w:pStyle w:val="ListParagraph"/>
-        <w:numPr>
-          <w:ilvl w:val="0"/>
-          <w:numId w:val="2"/>
-        </w:numPr>
-        <w:spacing w:after="80"/>
-      </w:pPr>
-      <w:r>
-        <w:rPr>
-          <w:rFonts w:ascii="Arial" w:cs="Arial" w:eastAsia="Arial" w:hAnsi="Arial"/>
-          <w:color w:val="1A2433"/>
-          <w:sz w:val="22"/>
-          <w:szCs w:val="22"/>
-        </w:rPr>
-        <w:t xml:space="preserve">Refrescar (Ctrl+R / Cmd+R) — resuelve 80% de los problemas</w:t>
-      </w:r>
-    </w:p>
-    <w:p>
-      <w:pPr>
-        <w:pStyle w:val="ListParagraph"/>
-        <w:numPr>
-          <w:ilvl w:val="0"/>
-          <w:numId w:val="2"/>
-        </w:numPr>
-        <w:spacing w:after="80"/>
-      </w:pPr>
-      <w:r>
-        <w:rPr>
-          <w:rFonts w:ascii="Arial" w:cs="Arial" w:eastAsia="Arial" w:hAnsi="Arial"/>
-          <w:color w:val="1A2433"/>
-          <w:sz w:val="22"/>
-          <w:szCs w:val="22"/>
-        </w:rPr>
-        <w:t xml:space="preserve">Cerrar sesión y volver a entrar</w:t>
-      </w:r>
-    </w:p>
-    <w:p>
-      <w:pPr>
-        <w:pStyle w:val="ListParagraph"/>
-        <w:numPr>
-          <w:ilvl w:val="0"/>
-          <w:numId w:val="2"/>
-        </w:numPr>
-        <w:spacing w:after="80"/>
-      </w:pPr>
-      <w:r>
-        <w:rPr>
-          <w:rFonts w:ascii="Arial" w:cs="Arial" w:eastAsia="Arial" w:hAnsi="Arial"/>
-          <w:color w:val="1A2433"/>
-          <w:sz w:val="22"/>
-          <w:szCs w:val="22"/>
-        </w:rPr>
-        <w:t xml:space="preserve">Si persiste: avisa a Luis o JuanCho con captura de pantalla y el código de la misión afectada</w:t>
-      </w:r>
-    </w:p>
-    <w:p>
-      <w:pPr>
-        <w:pBdr>
-          <w:left w:val="single" w:color="F04E1C" w:sz="18" w:space="12"/>
-        </w:pBdr>
-        <w:spacing w:after="120" w:before="120"/>
-        <w:ind w:left="360"/>
-      </w:pPr>
-      <w:r>
-        <w:rPr>
-          <w:rFonts w:ascii="Arial" w:cs="Arial" w:eastAsia="Arial" w:hAnsi="Arial"/>
-          <w:i/>
-          <w:iCs/>
-          <w:color w:val="5A7A9A"/>
-          <w:sz w:val="22"/>
-          <w:szCs w:val="22"/>
-        </w:rPr>
-        <w:t xml:space="preserve">Nunca borres datos manualmente desde la app si no estás seguro — todo deja rastro en audit log.</w:t>
+        <w:t xml:space="preserve">Nunca borres datos manualmente desde la app. Todo deja rastro en audit log.</w:t>
       </w:r>
     </w:p>
     <w:p>
@@ -3595,30 +3224,7 @@
           <w:sz w:val="20"/>
           <w:szCs w:val="20"/>
         </w:rPr>
-        <w:t xml:space="preserve">Cualquier duda → JuanCho o Luis.</w:t>
-      </w:r>
-    </w:p>
-    <w:p>
-      <w:pPr>
-        <w:spacing w:after="120" w:line="300"/>
-        <w:rPr>
-          <w:i/>
-          <w:iCs/>
-          <w:color w:val="5A7A9A"/>
-          <w:sz w:val="20"/>
-          <w:szCs w:val="20"/>
-        </w:rPr>
-      </w:pPr>
-      <w:r>
-        <w:rPr>
-          <w:rFonts w:ascii="Arial" w:cs="Arial" w:eastAsia="Arial" w:hAnsi="Arial"/>
-          <w:i/>
-          <w:iCs/>
-          <w:color w:val="5A7A9A"/>
-          <w:sz w:val="20"/>
-          <w:szCs w:val="20"/>
-        </w:rPr>
-        <w:t xml:space="preserve">Cambios en este manual: pídelos por Notion.</w:t>
+        <w:t xml:space="preserve">Cualquier duda → Luis (administrador) o JuanCho.</w:t>
       </w:r>
     </w:p>
     <w:sectPr>
@@ -3708,7 +3314,7 @@
         <w:sz w:val="18"/>
         <w:szCs w:val="18"/>
       </w:rPr>
-      <w:t xml:space="preserve"> · OpsManager v1.0 · 2026-04-30</w:t>
+      <w:t xml:space="preserve"> · OpsManager v1.1 · 2026-05-02</w:t>
     </w:r>
   </w:p>
 </w:ftr>
@@ -3887,13 +3493,13 @@
     </w:lvlOverride>
   </w:num>
   <w:num w:numId="2">
-    <w:abstractNumId w:val="3"/>
+    <w:abstractNumId w:val="2"/>
     <w:lvlOverride w:ilvl="0">
       <w:startOverride w:val="1"/>
     </w:lvlOverride>
   </w:num>
   <w:num w:numId="3">
-    <w:abstractNumId w:val="2"/>
+    <w:abstractNumId w:val="3"/>
     <w:lvlOverride w:ilvl="0">
       <w:startOverride w:val="1"/>
     </w:lvlOverride>

</xml_diff>